<commit_message>
Regeneration des exports Word et PDF (revision 33)
Prise en compte des trois sections ajoutees au document :
- "Je cherche quoi, j'ouvre quel fichier" : les 22 constantes reglables,
  avec leur fichier et leur numero de ligne
- "Ce qui est actualise a chaque jalon" : tableau T1 / T2 / T3, ce qui ne
  bouge jamais, et les deux reserves (b jamais reestime, scenarios non
  re-ancres au T3)
- "Toutes les strategies testees" : origine de A/B/C/D, les 31 combinaisons
  balayees, les mix de produits et les options du T2

Le PDF passe de 38 a 40 pages.

Co-Authored-By: Claude Opus 5 <noreply@anthropic.com>
Claude-Session: https://claude.ai/code/session_01RNL6Jhn5rE1VVnxEKFCFYa
</commit_message>
<xml_diff>
--- a/MarketGame/Version Light/export/Market Game 2027 - comprendre le code etape par etape.docx
+++ b/MarketGame/Version Light/export/Market Game 2027 - comprendre le code etape par etape.docx
@@ -2795,6 +2795,1582 @@
     </w:p>
     <w:p>
       <w:pPr>
+        <w:pStyle w:val="Heading3"/>
+      </w:pPr>
+      <w:r>
+        <w:t xml:space="preserve">Je cherche quoi, j'ouvre quel fichier</w:t>
+      </w:r>
+    </w:p>
+    <w:p>
+      <w:pPr/>
+      <w:r>
+        <w:t xml:space="preserve">Tout ce qui se règle est </w:t>
+      </w:r>
+      <w:r>
+        <w:rPr>
+          <w:b/>
+        </w:rPr>
+        <w:t xml:space="preserve">en tête de fichier</w:t>
+      </w:r>
+      <w:r>
+        <w:t xml:space="preserve">, avant la première fonction. Jamais besoin de descendre dans le corps du code pour changer un paramètre.</w:t>
+      </w:r>
+    </w:p>
+    <w:tbl>
+      <w:tblPr>
+        <w:tblStyle w:val="TableGrid"/>
+        <w:tblW w:w="0" w:type="auto"/>
+        <w:tblLayout w:type="fixed"/>
+        <w:tblLook w:val="04A0" w:firstRow="1" w:lastRow="0" w:firstColumn="0" w:lastColumn="0" w:noHBand="0" w:noVBand="1"/>
+      </w:tblPr>
+      <w:tblGrid>
+        <w:gridCol w:w="3120"/>
+        <w:gridCol w:w="3120"/>
+        <w:gridCol w:w="3120"/>
+      </w:tblGrid>
+      <w:tr>
+        <w:trPr>
+          <w:tblHeader/>
+        </w:trPr>
+        <w:tc>
+          <w:tcPr>
+            <w:tcW w:w="3120" w:type="dxa"/>
+            <w:shd w:val="clear" w:color="auto" w:fill="F2F2F2"/>
+          </w:tcPr>
+          <w:p>
+            <w:pPr/>
+            <w:r>
+              <w:t xml:space="preserve">Ce que je veux voir ou changer</w:t>
+            </w:r>
+          </w:p>
+        </w:tc>
+        <w:tc>
+          <w:tcPr>
+            <w:tcW w:w="3120" w:type="dxa"/>
+            <w:shd w:val="clear" w:color="auto" w:fill="F2F2F2"/>
+          </w:tcPr>
+          <w:p>
+            <w:pPr/>
+            <w:r>
+              <w:t xml:space="preserve">Fichier</w:t>
+            </w:r>
+          </w:p>
+        </w:tc>
+        <w:tc>
+          <w:tcPr>
+            <w:tcW w:w="3120" w:type="dxa"/>
+            <w:shd w:val="clear" w:color="auto" w:fill="F2F2F2"/>
+          </w:tcPr>
+          <w:p>
+            <w:pPr/>
+            <w:r>
+              <w:t xml:space="preserve">Ligne</w:t>
+            </w:r>
+          </w:p>
+        </w:tc>
+      </w:tr>
+      <w:tr>
+        <w:tc>
+          <w:tcPr>
+            <w:tcW w:w="3120" w:type="dxa"/>
+          </w:tcPr>
+          <w:p>
+            <w:pPr/>
+            <w:r>
+              <w:t xml:space="preserve">Année cible</w:t>
+            </w:r>
+          </w:p>
+        </w:tc>
+        <w:tc>
+          <w:tcPr>
+            <w:tcW w:w="3120" w:type="dxa"/>
+          </w:tcPr>
+          <w:p>
+            <w:pPr/>
+            <w:r>
+              <w:rPr>
+                <w:rStyle w:val="CodeChar"/>
+              </w:rPr>
+              <w:t xml:space="preserve">Modelisation_Conso.py</w:t>
+            </w:r>
+          </w:p>
+        </w:tc>
+        <w:tc>
+          <w:tcPr>
+            <w:tcW w:w="3120" w:type="dxa"/>
+          </w:tcPr>
+          <w:p>
+            <w:pPr/>
+            <w:r>
+              <w:t xml:space="preserve">9</w:t>
+            </w:r>
+          </w:p>
+        </w:tc>
+      </w:tr>
+      <w:tr>
+        <w:tc>
+          <w:tcPr>
+            <w:tcW w:w="3120" w:type="dxa"/>
+          </w:tcPr>
+          <w:p>
+            <w:pPr/>
+            <w:r>
+              <w:t xml:space="preserve">FUD : clients, kVA, Θ</w:t>
+            </w:r>
+          </w:p>
+        </w:tc>
+        <w:tc>
+          <w:tcPr>
+            <w:tcW w:w="3120" w:type="dxa"/>
+          </w:tcPr>
+          <w:p>
+            <w:pPr/>
+            <w:r>
+              <w:rPr>
+                <w:rStyle w:val="CodeChar"/>
+              </w:rPr>
+              <w:t xml:space="preserve">Modelisation_Conso.py</w:t>
+            </w:r>
+            <w:r>
+              <w:t xml:space="preserve"> — </w:t>
+            </w:r>
+            <w:r>
+              <w:rPr>
+                <w:rStyle w:val="CodeChar"/>
+              </w:rPr>
+              <w:t xml:space="preserve">PARAMS</w:t>
+            </w:r>
+          </w:p>
+        </w:tc>
+        <w:tc>
+          <w:tcPr>
+            <w:tcW w:w="3120" w:type="dxa"/>
+          </w:tcPr>
+          <w:p>
+            <w:pPr/>
+            <w:r>
+              <w:t xml:space="preserve">11</w:t>
+            </w:r>
+          </w:p>
+        </w:tc>
+      </w:tr>
+      <w:tr>
+        <w:tc>
+          <w:tcPr>
+            <w:tcW w:w="3120" w:type="dxa"/>
+          </w:tcPr>
+          <w:p>
+            <w:pPr/>
+            <w:r>
+              <w:rPr>
+                <w:b/>
+              </w:rPr>
+              <w:t xml:space="preserve">Les trois jalons commerciaux</w:t>
+            </w:r>
+          </w:p>
+        </w:tc>
+        <w:tc>
+          <w:tcPr>
+            <w:tcW w:w="3120" w:type="dxa"/>
+          </w:tcPr>
+          <w:p>
+            <w:pPr/>
+            <w:r>
+              <w:rPr>
+                <w:rStyle w:val="CodeChar"/>
+              </w:rPr>
+              <w:t xml:space="preserve">Modelisation_Conso.py</w:t>
+            </w:r>
+            <w:r>
+              <w:t xml:space="preserve"> — </w:t>
+            </w:r>
+            <w:r>
+              <w:rPr>
+                <w:rStyle w:val="CodeChar"/>
+              </w:rPr>
+              <w:t xml:space="preserve">CLIENTS</w:t>
+            </w:r>
+          </w:p>
+        </w:tc>
+        <w:tc>
+          <w:tcPr>
+            <w:tcW w:w="3120" w:type="dxa"/>
+          </w:tcPr>
+          <w:p>
+            <w:pPr/>
+            <w:r>
+              <w:t xml:space="preserve">15</w:t>
+            </w:r>
+          </w:p>
+        </w:tc>
+      </w:tr>
+      <w:tr>
+        <w:tc>
+          <w:tcPr>
+            <w:tcW w:w="3120" w:type="dxa"/>
+          </w:tcPr>
+          <w:p>
+            <w:pPr/>
+            <w:r>
+              <w:t xml:space="preserve">Seuil de chauffe 15 °C</w:t>
+            </w:r>
+          </w:p>
+        </w:tc>
+        <w:tc>
+          <w:tcPr>
+            <w:tcW w:w="3120" w:type="dxa"/>
+          </w:tcPr>
+          <w:p>
+            <w:pPr/>
+            <w:r>
+              <w:rPr>
+                <w:rStyle w:val="CodeChar"/>
+              </w:rPr>
+              <w:t xml:space="preserve">Modelisation_Conso.py</w:t>
+            </w:r>
+          </w:p>
+        </w:tc>
+        <w:tc>
+          <w:tcPr>
+            <w:tcW w:w="3120" w:type="dxa"/>
+          </w:tcPr>
+          <w:p>
+            <w:pPr/>
+            <w:r>
+              <w:t xml:space="preserve">22</w:t>
+            </w:r>
+          </w:p>
+        </w:tc>
+      </w:tr>
+      <w:tr>
+        <w:tc>
+          <w:tcPr>
+            <w:tcW w:w="3120" w:type="dxa"/>
+          </w:tcPr>
+          <w:p>
+            <w:pPr/>
+            <w:r>
+              <w:t xml:space="preserve">Noms des fichiers CSV</w:t>
+            </w:r>
+          </w:p>
+        </w:tc>
+        <w:tc>
+          <w:tcPr>
+            <w:tcW w:w="3120" w:type="dxa"/>
+          </w:tcPr>
+          <w:p>
+            <w:pPr/>
+            <w:r>
+              <w:rPr>
+                <w:rStyle w:val="CodeChar"/>
+              </w:rPr>
+              <w:t xml:space="preserve">Modelisation_Conso.py</w:t>
+            </w:r>
+            <w:r>
+              <w:t xml:space="preserve"> — </w:t>
+            </w:r>
+            <w:r>
+              <w:rPr>
+                <w:rStyle w:val="CodeChar"/>
+              </w:rPr>
+              <w:t xml:space="preserve">FICHIERS</w:t>
+            </w:r>
+          </w:p>
+        </w:tc>
+        <w:tc>
+          <w:tcPr>
+            <w:tcW w:w="3120" w:type="dxa"/>
+          </w:tcPr>
+          <w:p>
+            <w:pPr/>
+            <w:r>
+              <w:t xml:space="preserve">26</w:t>
+            </w:r>
+          </w:p>
+        </w:tc>
+      </w:tr>
+      <w:tr>
+        <w:tc>
+          <w:tcPr>
+            <w:tcW w:w="3120" w:type="dxa"/>
+          </w:tcPr>
+          <w:p>
+            <w:pPr/>
+            <w:r>
+              <w:t xml:space="preserve">Les 4 cas RTE</w:t>
+            </w:r>
+          </w:p>
+        </w:tc>
+        <w:tc>
+          <w:tcPr>
+            <w:tcW w:w="3120" w:type="dxa"/>
+          </w:tcPr>
+          <w:p>
+            <w:pPr/>
+            <w:r>
+              <w:rPr>
+                <w:rStyle w:val="CodeChar"/>
+              </w:rPr>
+              <w:t xml:space="preserve">Modelisation_Conso.py</w:t>
+            </w:r>
+            <w:r>
+              <w:t xml:space="preserve"> — </w:t>
+            </w:r>
+            <w:r>
+              <w:rPr>
+                <w:rStyle w:val="CodeChar"/>
+              </w:rPr>
+              <w:t xml:space="preserve">coefficient_meteo()</w:t>
+            </w:r>
+          </w:p>
+        </w:tc>
+        <w:tc>
+          <w:tcPr>
+            <w:tcW w:w="3120" w:type="dxa"/>
+          </w:tcPr>
+          <w:p>
+            <w:pPr/>
+            <w:r>
+              <w:t xml:space="preserve">84</w:t>
+            </w:r>
+          </w:p>
+        </w:tc>
+      </w:tr>
+      <w:tr>
+        <w:tc>
+          <w:tcPr>
+            <w:tcW w:w="3120" w:type="dxa"/>
+          </w:tcPr>
+          <w:p>
+            <w:pPr/>
+            <w:r>
+              <w:rPr>
+                <w:b/>
+              </w:rPr>
+              <w:t xml:space="preserve">Tous les prix EEX</w:t>
+            </w:r>
+            <w:r>
+              <w:t xml:space="preserve"> (3 jalons, Base et Peak)</w:t>
+            </w:r>
+          </w:p>
+        </w:tc>
+        <w:tc>
+          <w:tcPr>
+            <w:tcW w:w="3120" w:type="dxa"/>
+          </w:tcPr>
+          <w:p>
+            <w:pPr/>
+            <w:r>
+              <w:rPr>
+                <w:rStyle w:val="CodeChar"/>
+              </w:rPr>
+              <w:t xml:space="preserve">scenarios.py</w:t>
+            </w:r>
+            <w:r>
+              <w:t xml:space="preserve"> — </w:t>
+            </w:r>
+            <w:r>
+              <w:rPr>
+                <w:rStyle w:val="CodeChar"/>
+              </w:rPr>
+              <w:t xml:space="preserve">EEX</w:t>
+            </w:r>
+          </w:p>
+        </w:tc>
+        <w:tc>
+          <w:tcPr>
+            <w:tcW w:w="3120" w:type="dxa"/>
+          </w:tcPr>
+          <w:p>
+            <w:pPr/>
+            <w:r>
+              <w:t xml:space="preserve">20</w:t>
+            </w:r>
+          </w:p>
+        </w:tc>
+      </w:tr>
+      <w:tr>
+        <w:tc>
+          <w:tcPr>
+            <w:tcW w:w="3120" w:type="dxa"/>
+          </w:tcPr>
+          <w:p>
+            <w:pPr/>
+            <w:r>
+              <w:t xml:space="preserve">Prime de risque, volatilité CRE</w:t>
+            </w:r>
+          </w:p>
+        </w:tc>
+        <w:tc>
+          <w:tcPr>
+            <w:tcW w:w="3120" w:type="dxa"/>
+          </w:tcPr>
+          <w:p>
+            <w:pPr/>
+            <w:r>
+              <w:rPr>
+                <w:rStyle w:val="CodeChar"/>
+              </w:rPr>
+              <w:t xml:space="preserve">scenarios.py</w:t>
+            </w:r>
+          </w:p>
+        </w:tc>
+        <w:tc>
+          <w:tcPr>
+            <w:tcW w:w="3120" w:type="dxa"/>
+          </w:tcPr>
+          <w:p>
+            <w:pPr/>
+            <w:r>
+              <w:t xml:space="preserve">13-14</w:t>
+            </w:r>
+          </w:p>
+        </w:tc>
+      </w:tr>
+      <w:tr>
+        <w:tc>
+          <w:tcPr>
+            <w:tcW w:w="3120" w:type="dxa"/>
+          </w:tcPr>
+          <w:p>
+            <w:pPr/>
+            <w:r>
+              <w:t xml:space="preserve">Le calcul de </w:t>
+            </w:r>
+            <w:r>
+              <w:rPr>
+                <w:rStyle w:val="CodeChar"/>
+              </w:rPr>
+              <w:t xml:space="preserve">b</w:t>
+            </w:r>
+          </w:p>
+        </w:tc>
+        <w:tc>
+          <w:tcPr>
+            <w:tcW w:w="3120" w:type="dxa"/>
+          </w:tcPr>
+          <w:p>
+            <w:pPr/>
+            <w:r>
+              <w:rPr>
+                <w:rStyle w:val="CodeChar"/>
+              </w:rPr>
+              <w:t xml:space="preserve">scenarios.py</w:t>
+            </w:r>
+            <w:r>
+              <w:t xml:space="preserve"> — </w:t>
+            </w:r>
+            <w:r>
+              <w:rPr>
+                <w:rStyle w:val="CodeChar"/>
+              </w:rPr>
+              <w:t xml:space="preserve">pente_prix_volume()</w:t>
+            </w:r>
+          </w:p>
+        </w:tc>
+        <w:tc>
+          <w:tcPr>
+            <w:tcW w:w="3120" w:type="dxa"/>
+          </w:tcPr>
+          <w:p>
+            <w:pPr/>
+            <w:r>
+              <w:t xml:space="preserve">159</w:t>
+            </w:r>
+          </w:p>
+        </w:tc>
+      </w:tr>
+      <w:tr>
+        <w:tc>
+          <w:tcPr>
+            <w:tcW w:w="3120" w:type="dxa"/>
+          </w:tcPr>
+          <w:p>
+            <w:pPr/>
+            <w:r>
+              <w:t xml:space="preserve">Level × Shape</w:t>
+            </w:r>
+          </w:p>
+        </w:tc>
+        <w:tc>
+          <w:tcPr>
+            <w:tcW w:w="3120" w:type="dxa"/>
+          </w:tcPr>
+          <w:p>
+            <w:pPr/>
+            <w:r>
+              <w:rPr>
+                <w:rStyle w:val="CodeChar"/>
+              </w:rPr>
+              <w:t xml:space="preserve">scenarios.py</w:t>
+            </w:r>
+            <w:r>
+              <w:t xml:space="preserve"> — </w:t>
+            </w:r>
+            <w:r>
+              <w:rPr>
+                <w:rStyle w:val="CodeChar"/>
+              </w:rPr>
+              <w:t xml:space="preserve">scenario_spot()</w:t>
+            </w:r>
+          </w:p>
+        </w:tc>
+        <w:tc>
+          <w:tcPr>
+            <w:tcW w:w="3120" w:type="dxa"/>
+          </w:tcPr>
+          <w:p>
+            <w:pPr/>
+            <w:r>
+              <w:t xml:space="preserve">172</w:t>
+            </w:r>
+          </w:p>
+        </w:tc>
+      </w:tr>
+      <w:tr>
+        <w:tc>
+          <w:tcPr>
+            <w:tcW w:w="3120" w:type="dxa"/>
+          </w:tcPr>
+          <w:p>
+            <w:pPr/>
+            <w:r>
+              <w:t xml:space="preserve">Années de scénario</w:t>
+            </w:r>
+          </w:p>
+        </w:tc>
+        <w:tc>
+          <w:tcPr>
+            <w:tcW w:w="3120" w:type="dxa"/>
+          </w:tcPr>
+          <w:p>
+            <w:pPr/>
+            <w:r>
+              <w:rPr>
+                <w:rStyle w:val="CodeChar"/>
+              </w:rPr>
+              <w:t xml:space="preserve">comparaison_scenarios.py</w:t>
+            </w:r>
+            <w:r>
+              <w:t xml:space="preserve"> — </w:t>
+            </w:r>
+            <w:r>
+              <w:rPr>
+                <w:rStyle w:val="CodeChar"/>
+              </w:rPr>
+              <w:t xml:space="preserve">ANNEES</w:t>
+            </w:r>
+          </w:p>
+        </w:tc>
+        <w:tc>
+          <w:tcPr>
+            <w:tcW w:w="3120" w:type="dxa"/>
+          </w:tcPr>
+          <w:p>
+            <w:pPr/>
+            <w:r>
+              <w:t xml:space="preserve">8</w:t>
+            </w:r>
+          </w:p>
+        </w:tc>
+      </w:tr>
+      <w:tr>
+        <w:tc>
+          <w:tcPr>
+            <w:tcW w:w="3120" w:type="dxa"/>
+          </w:tcPr>
+          <w:p>
+            <w:pPr/>
+            <w:r>
+              <w:t xml:space="preserve">Prix de vente, marge cible, plancher</w:t>
+            </w:r>
+          </w:p>
+        </w:tc>
+        <w:tc>
+          <w:tcPr>
+            <w:tcW w:w="3120" w:type="dxa"/>
+          </w:tcPr>
+          <w:p>
+            <w:pPr/>
+            <w:r>
+              <w:rPr>
+                <w:rStyle w:val="CodeChar"/>
+              </w:rPr>
+              <w:t xml:space="preserve">comparaison_scenarios.py</w:t>
+            </w:r>
+          </w:p>
+        </w:tc>
+        <w:tc>
+          <w:tcPr>
+            <w:tcW w:w="3120" w:type="dxa"/>
+          </w:tcPr>
+          <w:p>
+            <w:pPr/>
+            <w:r>
+              <w:t xml:space="preserve">11-13</w:t>
+            </w:r>
+          </w:p>
+        </w:tc>
+      </w:tr>
+      <w:tr>
+        <w:tc>
+          <w:tcPr>
+            <w:tcW w:w="3120" w:type="dxa"/>
+          </w:tcPr>
+          <w:p>
+            <w:pPr/>
+            <w:r>
+              <w:t xml:space="preserve">Mix par défaut (cal / trimestres / +peak)</w:t>
+            </w:r>
+          </w:p>
+        </w:tc>
+        <w:tc>
+          <w:tcPr>
+            <w:tcW w:w="3120" w:type="dxa"/>
+          </w:tcPr>
+          <w:p>
+            <w:pPr/>
+            <w:r>
+              <w:rPr>
+                <w:rStyle w:val="CodeChar"/>
+              </w:rPr>
+              <w:t xml:space="preserve">comparaison_scenarios.py</w:t>
+            </w:r>
+            <w:r>
+              <w:t xml:space="preserve"> — </w:t>
+            </w:r>
+            <w:r>
+              <w:rPr>
+                <w:rStyle w:val="CodeChar"/>
+              </w:rPr>
+              <w:t xml:space="preserve">FORME</w:t>
+            </w:r>
+          </w:p>
+        </w:tc>
+        <w:tc>
+          <w:tcPr>
+            <w:tcW w:w="3120" w:type="dxa"/>
+          </w:tcPr>
+          <w:p>
+            <w:pPr/>
+            <w:r>
+              <w:t xml:space="preserve">15</w:t>
+            </w:r>
+          </w:p>
+        </w:tc>
+      </w:tr>
+      <w:tr>
+        <w:tc>
+          <w:tcPr>
+            <w:tcW w:w="3120" w:type="dxa"/>
+          </w:tcPr>
+          <w:p>
+            <w:pPr/>
+            <w:r>
+              <w:rPr>
+                <w:b/>
+              </w:rPr>
+              <w:t xml:space="preserve">Le scénario de choc</w:t>
+            </w:r>
+          </w:p>
+        </w:tc>
+        <w:tc>
+          <w:tcPr>
+            <w:tcW w:w="3120" w:type="dxa"/>
+          </w:tcPr>
+          <w:p>
+            <w:pPr/>
+            <w:r>
+              <w:rPr>
+                <w:rStyle w:val="CodeChar"/>
+              </w:rPr>
+              <w:t xml:space="preserve">comparaison_scenarios.py</w:t>
+            </w:r>
+          </w:p>
+        </w:tc>
+        <w:tc>
+          <w:tcPr>
+            <w:tcW w:w="3120" w:type="dxa"/>
+          </w:tcPr>
+          <w:p>
+            <w:pPr/>
+            <w:r>
+              <w:t xml:space="preserve">21-22</w:t>
+            </w:r>
+          </w:p>
+        </w:tc>
+      </w:tr>
+      <w:tr>
+        <w:tc>
+          <w:tcPr>
+            <w:tcW w:w="3120" w:type="dxa"/>
+          </w:tcPr>
+          <w:p>
+            <w:pPr/>
+            <w:r>
+              <w:rPr>
+                <w:b/>
+              </w:rPr>
+              <w:t xml:space="preserve">Les six stratégies</w:t>
+            </w:r>
+          </w:p>
+        </w:tc>
+        <w:tc>
+          <w:tcPr>
+            <w:tcW w:w="3120" w:type="dxa"/>
+          </w:tcPr>
+          <w:p>
+            <w:pPr/>
+            <w:r>
+              <w:rPr>
+                <w:rStyle w:val="CodeChar"/>
+              </w:rPr>
+              <w:t xml:space="preserve">comparaison_scenarios.py</w:t>
+            </w:r>
+            <w:r>
+              <w:t xml:space="preserve"> — </w:t>
+            </w:r>
+            <w:r>
+              <w:rPr>
+                <w:rStyle w:val="CodeChar"/>
+              </w:rPr>
+              <w:t xml:space="preserve">STRATEGIES</w:t>
+            </w:r>
+          </w:p>
+        </w:tc>
+        <w:tc>
+          <w:tcPr>
+            <w:tcW w:w="3120" w:type="dxa"/>
+          </w:tcPr>
+          <w:p>
+            <w:pPr/>
+            <w:r>
+              <w:t xml:space="preserve">24</w:t>
+            </w:r>
+          </w:p>
+        </w:tc>
+      </w:tr>
+      <w:tr>
+        <w:tc>
+          <w:tcPr>
+            <w:tcW w:w="3120" w:type="dxa"/>
+          </w:tcPr>
+          <w:p>
+            <w:pPr/>
+            <w:r>
+              <w:t xml:space="preserve">Fenêtres de livraison des produits</w:t>
+            </w:r>
+          </w:p>
+        </w:tc>
+        <w:tc>
+          <w:tcPr>
+            <w:tcW w:w="3120" w:type="dxa"/>
+          </w:tcPr>
+          <w:p>
+            <w:pPr/>
+            <w:r>
+              <w:rPr>
+                <w:rStyle w:val="CodeChar"/>
+              </w:rPr>
+              <w:t xml:space="preserve">comparaison_scenarios.py</w:t>
+            </w:r>
+            <w:r>
+              <w:t xml:space="preserve"> — </w:t>
+            </w:r>
+            <w:r>
+              <w:rPr>
+                <w:rStyle w:val="CodeChar"/>
+              </w:rPr>
+              <w:t xml:space="preserve">fenetre()</w:t>
+            </w:r>
+          </w:p>
+        </w:tc>
+        <w:tc>
+          <w:tcPr>
+            <w:tcW w:w="3120" w:type="dxa"/>
+          </w:tcPr>
+          <w:p>
+            <w:pPr/>
+            <w:r>
+              <w:t xml:space="preserve">37</w:t>
+            </w:r>
+          </w:p>
+        </w:tc>
+      </w:tr>
+      <w:tr>
+        <w:tc>
+          <w:tcPr>
+            <w:tcW w:w="3120" w:type="dxa"/>
+          </w:tcPr>
+          <w:p>
+            <w:pPr/>
+            <w:r>
+              <w:t xml:space="preserve">Pourcentages → MW par produit</w:t>
+            </w:r>
+          </w:p>
+        </w:tc>
+        <w:tc>
+          <w:tcPr>
+            <w:tcW w:w="3120" w:type="dxa"/>
+          </w:tcPr>
+          <w:p>
+            <w:pPr/>
+            <w:r>
+              <w:rPr>
+                <w:rStyle w:val="CodeChar"/>
+              </w:rPr>
+              <w:t xml:space="preserve">comparaison_scenarios.py</w:t>
+            </w:r>
+            <w:r>
+              <w:t xml:space="preserve"> — </w:t>
+            </w:r>
+            <w:r>
+              <w:rPr>
+                <w:rStyle w:val="CodeChar"/>
+              </w:rPr>
+              <w:t xml:space="preserve">construire_mix()</w:t>
+            </w:r>
+          </w:p>
+        </w:tc>
+        <w:tc>
+          <w:tcPr>
+            <w:tcW w:w="3120" w:type="dxa"/>
+          </w:tcPr>
+          <w:p>
+            <w:pPr/>
+            <w:r>
+              <w:t xml:space="preserve">68</w:t>
+            </w:r>
+          </w:p>
+        </w:tc>
+      </w:tr>
+      <w:tr>
+        <w:tc>
+          <w:tcPr>
+            <w:tcW w:w="3120" w:type="dxa"/>
+          </w:tcPr>
+          <w:p>
+            <w:pPr/>
+            <w:r>
+              <w:t xml:space="preserve">Le calcul de marge</w:t>
+            </w:r>
+          </w:p>
+        </w:tc>
+        <w:tc>
+          <w:tcPr>
+            <w:tcW w:w="3120" w:type="dxa"/>
+          </w:tcPr>
+          <w:p>
+            <w:pPr/>
+            <w:r>
+              <w:rPr>
+                <w:rStyle w:val="CodeChar"/>
+              </w:rPr>
+              <w:t xml:space="preserve">comparaison_scenarios.py</w:t>
+            </w:r>
+            <w:r>
+              <w:t xml:space="preserve"> — </w:t>
+            </w:r>
+            <w:r>
+              <w:rPr>
+                <w:rStyle w:val="CodeChar"/>
+              </w:rPr>
+              <w:t xml:space="preserve">marge()</w:t>
+            </w:r>
+          </w:p>
+        </w:tc>
+        <w:tc>
+          <w:tcPr>
+            <w:tcW w:w="3120" w:type="dxa"/>
+          </w:tcPr>
+          <w:p>
+            <w:pPr/>
+            <w:r>
+              <w:t xml:space="preserve">160</w:t>
+            </w:r>
+          </w:p>
+        </w:tc>
+      </w:tr>
+      <w:tr>
+        <w:tc>
+          <w:tcPr>
+            <w:tcW w:w="3120" w:type="dxa"/>
+          </w:tcPr>
+          <w:p>
+            <w:pPr/>
+            <w:r>
+              <w:t xml:space="preserve">Stratégie T1 retenue, options du T2</w:t>
+            </w:r>
+          </w:p>
+        </w:tc>
+        <w:tc>
+          <w:tcPr>
+            <w:tcW w:w="3120" w:type="dxa"/>
+          </w:tcPr>
+          <w:p>
+            <w:pPr/>
+            <w:r>
+              <w:rPr>
+                <w:rStyle w:val="CodeChar"/>
+              </w:rPr>
+              <w:t xml:space="preserve">decision_t2.py</w:t>
+            </w:r>
+          </w:p>
+        </w:tc>
+        <w:tc>
+          <w:tcPr>
+            <w:tcW w:w="3120" w:type="dxa"/>
+          </w:tcPr>
+          <w:p>
+            <w:pPr/>
+            <w:r>
+              <w:t xml:space="preserve">10-11</w:t>
+            </w:r>
+          </w:p>
+        </w:tc>
+      </w:tr>
+      <w:tr>
+        <w:tc>
+          <w:tcPr>
+            <w:tcW w:w="3120" w:type="dxa"/>
+          </w:tcPr>
+          <w:p>
+            <w:pPr/>
+            <w:r>
+              <w:t xml:space="preserve">Température prévue, production solaire</w:t>
+            </w:r>
+          </w:p>
+        </w:tc>
+        <w:tc>
+          <w:tcPr>
+            <w:tcW w:w="3120" w:type="dxa"/>
+          </w:tcPr>
+          <w:p>
+            <w:pPr/>
+            <w:r>
+              <w:rPr>
+                <w:rStyle w:val="CodeChar"/>
+              </w:rPr>
+              <w:t xml:space="preserve">spot_t3.py</w:t>
+            </w:r>
+          </w:p>
+        </w:tc>
+        <w:tc>
+          <w:tcPr>
+            <w:tcW w:w="3120" w:type="dxa"/>
+          </w:tcPr>
+          <w:p>
+            <w:pPr/>
+            <w:r>
+              <w:t xml:space="preserve">16, 18</w:t>
+            </w:r>
+          </w:p>
+        </w:tc>
+      </w:tr>
+      <w:tr>
+        <w:tc>
+          <w:tcPr>
+            <w:tcW w:w="3120" w:type="dxa"/>
+          </w:tcPr>
+          <w:p>
+            <w:pPr/>
+            <w:r>
+              <w:rPr>
+                <w:b/>
+              </w:rPr>
+              <w:t xml:space="preserve">Ce qui est déjà acheté</w:t>
+            </w:r>
+          </w:p>
+        </w:tc>
+        <w:tc>
+          <w:tcPr>
+            <w:tcW w:w="3120" w:type="dxa"/>
+          </w:tcPr>
+          <w:p>
+            <w:pPr/>
+            <w:r>
+              <w:rPr>
+                <w:rStyle w:val="CodeChar"/>
+              </w:rPr>
+              <w:t xml:space="preserve">spot_t3.py</w:t>
+            </w:r>
+            <w:r>
+              <w:t xml:space="preserve"> — </w:t>
+            </w:r>
+            <w:r>
+              <w:rPr>
+                <w:rStyle w:val="CodeChar"/>
+              </w:rPr>
+              <w:t xml:space="preserve">POSITION</w:t>
+            </w:r>
+          </w:p>
+        </w:tc>
+        <w:tc>
+          <w:tcPr>
+            <w:tcW w:w="3120" w:type="dxa"/>
+          </w:tcPr>
+          <w:p>
+            <w:pPr/>
+            <w:r>
+              <w:t xml:space="preserve">25</w:t>
+            </w:r>
+          </w:p>
+        </w:tc>
+      </w:tr>
+      <w:tr>
+        <w:tc>
+          <w:tcPr>
+            <w:tcW w:w="3120" w:type="dxa"/>
+          </w:tcPr>
+          <w:p>
+            <w:pPr/>
+            <w:r>
+              <w:t xml:space="preserve">⚠️ Production solaire </w:t>
+            </w:r>
+            <w:r>
+              <w:rPr>
+                <w:b/>
+              </w:rPr>
+              <w:t xml:space="preserve">annuelle</w:t>
+            </w:r>
+          </w:p>
+        </w:tc>
+        <w:tc>
+          <w:tcPr>
+            <w:tcW w:w="3120" w:type="dxa"/>
+          </w:tcPr>
+          <w:p>
+            <w:pPr/>
+            <w:r>
+              <w:rPr>
+                <w:rStyle w:val="CodeChar"/>
+              </w:rPr>
+              <w:t xml:space="preserve">spot_t3.py</w:t>
+            </w:r>
+            <w:r>
+              <w:t xml:space="preserve"> — </w:t>
+            </w:r>
+            <w:r>
+              <w:rPr>
+                <w:rStyle w:val="CodeChar"/>
+              </w:rPr>
+              <w:t xml:space="preserve">SOLAIRE_ANNUEL_MWH</w:t>
+            </w:r>
+          </w:p>
+        </w:tc>
+        <w:tc>
+          <w:tcPr>
+            <w:tcW w:w="3120" w:type="dxa"/>
+          </w:tcPr>
+          <w:p>
+            <w:pPr/>
+            <w:r>
+              <w:t xml:space="preserve">21</w:t>
+            </w:r>
+          </w:p>
+        </w:tc>
+      </w:tr>
+      <w:tr>
+        <w:tc>
+          <w:tcPr>
+            <w:tcW w:w="3120" w:type="dxa"/>
+          </w:tcPr>
+          <w:p>
+            <w:pPr/>
+            <w:r>
+              <w:t xml:space="preserve">⚠️ Prix de clearing</w:t>
+            </w:r>
+          </w:p>
+        </w:tc>
+        <w:tc>
+          <w:tcPr>
+            <w:tcW w:w="3120" w:type="dxa"/>
+          </w:tcPr>
+          <w:p>
+            <w:pPr/>
+            <w:r>
+              <w:rPr>
+                <w:rStyle w:val="CodeChar"/>
+              </w:rPr>
+              <w:t xml:space="preserve">spot_t3.py</w:t>
+            </w:r>
+            <w:r>
+              <w:t xml:space="preserve"> — </w:t>
+            </w:r>
+            <w:r>
+              <w:rPr>
+                <w:rStyle w:val="CodeChar"/>
+              </w:rPr>
+              <w:t xml:space="preserve">PRIX_CLEARING</w:t>
+            </w:r>
+          </w:p>
+        </w:tc>
+        <w:tc>
+          <w:tcPr>
+            <w:tcW w:w="3120" w:type="dxa"/>
+          </w:tcPr>
+          <w:p>
+            <w:pPr/>
+            <w:r>
+              <w:t xml:space="preserve">33</w:t>
+            </w:r>
+          </w:p>
+        </w:tc>
+      </w:tr>
+    </w:tbl>
+    <w:p>
+      <w:pPr/>
+      <w:r>
+        <w:t xml:space="preserve">Les deux dernières lignes sont à </w:t>
+      </w:r>
+      <w:r>
+        <w:rPr>
+          <w:rStyle w:val="CodeChar"/>
+        </w:rPr>
+        <w:t xml:space="preserve">None</w:t>
+      </w:r>
+      <w:r>
+        <w:t xml:space="preserve"> : ce sont les deux informations qui manquent pour terminer le T3.</w:t>
+      </w:r>
+    </w:p>
+    <w:p>
+      <w:pPr>
+        <w:pStyle w:val="Heading3"/>
+      </w:pPr>
+      <w:r>
+        <w:t xml:space="preserve">Ce qui est actualisé à chaque jalon</w:t>
+      </w:r>
+    </w:p>
+    <w:tbl>
+      <w:tblPr>
+        <w:tblStyle w:val="TableGrid"/>
+        <w:tblW w:w="0" w:type="auto"/>
+        <w:tblLayout w:type="fixed"/>
+        <w:tblLook w:val="04A0" w:firstRow="1" w:lastRow="0" w:firstColumn="0" w:lastColumn="0" w:noHBand="0" w:noVBand="1"/>
+      </w:tblPr>
+      <w:tblGrid>
+        <w:gridCol w:w="2340"/>
+        <w:gridCol w:w="2340"/>
+        <w:gridCol w:w="2340"/>
+        <w:gridCol w:w="2340"/>
+      </w:tblGrid>
+      <w:tr>
+        <w:trPr>
+          <w:tblHeader/>
+        </w:trPr>
+        <w:tc>
+          <w:tcPr>
+            <w:tcW w:w="2340" w:type="dxa"/>
+            <w:shd w:val="clear" w:color="auto" w:fill="F2F2F2"/>
+          </w:tcPr>
+          <w:p>
+            <w:pPr/>
+            <w:r>
+              <w:t xml:space="preserve">Donnée</w:t>
+            </w:r>
+          </w:p>
+        </w:tc>
+        <w:tc>
+          <w:tcPr>
+            <w:tcW w:w="2340" w:type="dxa"/>
+            <w:shd w:val="clear" w:color="auto" w:fill="F2F2F2"/>
+          </w:tcPr>
+          <w:p>
+            <w:pPr/>
+            <w:r>
+              <w:t xml:space="preserve">T1 (22/09)</w:t>
+            </w:r>
+          </w:p>
+        </w:tc>
+        <w:tc>
+          <w:tcPr>
+            <w:tcW w:w="2340" w:type="dxa"/>
+            <w:shd w:val="clear" w:color="auto" w:fill="F2F2F2"/>
+          </w:tcPr>
+          <w:p>
+            <w:pPr/>
+            <w:r>
+              <w:t xml:space="preserve">T2 (01/12)</w:t>
+            </w:r>
+          </w:p>
+        </w:tc>
+        <w:tc>
+          <w:tcPr>
+            <w:tcW w:w="2340" w:type="dxa"/>
+            <w:shd w:val="clear" w:color="auto" w:fill="F2F2F2"/>
+          </w:tcPr>
+          <w:p>
+            <w:pPr/>
+            <w:r>
+              <w:t xml:space="preserve">T3 (31/12)</w:t>
+            </w:r>
+          </w:p>
+        </w:tc>
+      </w:tr>
+      <w:tr>
+        <w:tc>
+          <w:tcPr>
+            <w:tcW w:w="2340" w:type="dxa"/>
+          </w:tcPr>
+          <w:p>
+            <w:pPr/>
+            <w:r>
+              <w:t xml:space="preserve">Prix EEX</w:t>
+            </w:r>
+          </w:p>
+        </w:tc>
+        <w:tc>
+          <w:tcPr>
+            <w:tcW w:w="2340" w:type="dxa"/>
+          </w:tcPr>
+          <w:p>
+            <w:pPr/>
+            <w:r>
+              <w:t xml:space="preserve">83,31</w:t>
+            </w:r>
+          </w:p>
+        </w:tc>
+        <w:tc>
+          <w:tcPr>
+            <w:tcW w:w="2340" w:type="dxa"/>
+          </w:tcPr>
+          <w:p>
+            <w:pPr/>
+            <w:r>
+              <w:t xml:space="preserve">73,70</w:t>
+            </w:r>
+          </w:p>
+        </w:tc>
+        <w:tc>
+          <w:tcPr>
+            <w:tcW w:w="2340" w:type="dxa"/>
+          </w:tcPr>
+          <w:p>
+            <w:pPr/>
+            <w:r>
+              <w:t xml:space="preserve">78,37</w:t>
+            </w:r>
+          </w:p>
+        </w:tc>
+      </w:tr>
+      <w:tr>
+        <w:tc>
+          <w:tcPr>
+            <w:tcW w:w="2340" w:type="dxa"/>
+          </w:tcPr>
+          <w:p>
+            <w:pPr/>
+            <w:r>
+              <w:t xml:space="preserve">Effectifs clients</w:t>
+            </w:r>
+          </w:p>
+        </w:tc>
+        <w:tc>
+          <w:tcPr>
+            <w:tcW w:w="2340" w:type="dxa"/>
+          </w:tcPr>
+          <w:p>
+            <w:pPr/>
+            <w:r>
+              <w:t xml:space="preserve">200 000 / 5 000</w:t>
+            </w:r>
+          </w:p>
+        </w:tc>
+        <w:tc>
+          <w:tcPr>
+            <w:tcW w:w="2340" w:type="dxa"/>
+          </w:tcPr>
+          <w:p>
+            <w:pPr/>
+            <w:r>
+              <w:t xml:space="preserve">188 200 / 4 585</w:t>
+            </w:r>
+          </w:p>
+        </w:tc>
+        <w:tc>
+          <w:tcPr>
+            <w:tcW w:w="2340" w:type="dxa"/>
+          </w:tcPr>
+          <w:p>
+            <w:pPr/>
+            <w:r>
+              <w:t xml:space="preserve">191 531 / 4 745</w:t>
+            </w:r>
+          </w:p>
+        </w:tc>
+      </w:tr>
+      <w:tr>
+        <w:tc>
+          <w:tcPr>
+            <w:tcW w:w="2340" w:type="dxa"/>
+          </w:tcPr>
+          <w:p>
+            <w:pPr/>
+            <w:r>
+              <w:t xml:space="preserve">Volume 2027</w:t>
+            </w:r>
+          </w:p>
+        </w:tc>
+        <w:tc>
+          <w:tcPr>
+            <w:tcW w:w="2340" w:type="dxa"/>
+          </w:tcPr>
+          <w:p>
+            <w:pPr/>
+            <w:r>
+              <w:t xml:space="preserve">536 627</w:t>
+            </w:r>
+          </w:p>
+        </w:tc>
+        <w:tc>
+          <w:tcPr>
+            <w:tcW w:w="2340" w:type="dxa"/>
+          </w:tcPr>
+          <w:p>
+            <w:pPr/>
+            <w:r>
+              <w:t xml:space="preserve">501 962</w:t>
+            </w:r>
+          </w:p>
+        </w:tc>
+        <w:tc>
+          <w:tcPr>
+            <w:tcW w:w="2340" w:type="dxa"/>
+          </w:tcPr>
+          <w:p>
+            <w:pPr/>
+            <w:r>
+              <w:t xml:space="preserve">512 820 MWh</w:t>
+            </w:r>
+          </w:p>
+        </w:tc>
+      </w:tr>
+      <w:tr>
+        <w:tc>
+          <w:tcPr>
+            <w:tcW w:w="2340" w:type="dxa"/>
+          </w:tcPr>
+          <w:p>
+            <w:pPr/>
+            <w:r>
+              <w:t xml:space="preserve">Niveau des scénarios</w:t>
+            </w:r>
+          </w:p>
+        </w:tc>
+        <w:tc>
+          <w:tcPr>
+            <w:tcW w:w="2340" w:type="dxa"/>
+          </w:tcPr>
+          <w:p>
+            <w:pPr/>
+            <w:r>
+              <w:t xml:space="preserve">ancré sur 83,31</w:t>
+            </w:r>
+          </w:p>
+        </w:tc>
+        <w:tc>
+          <w:tcPr>
+            <w:tcW w:w="2340" w:type="dxa"/>
+          </w:tcPr>
+          <w:p>
+            <w:pPr/>
+            <w:r>
+              <w:rPr>
+                <w:b/>
+              </w:rPr>
+              <w:t xml:space="preserve">ré-ancré sur 73,70</w:t>
+            </w:r>
+          </w:p>
+        </w:tc>
+        <w:tc>
+          <w:tcPr>
+            <w:tcW w:w="2340" w:type="dxa"/>
+          </w:tcPr>
+          <w:p>
+            <w:pPr/>
+            <w:r>
+              <w:t xml:space="preserve">—</w:t>
+            </w:r>
+          </w:p>
+        </w:tc>
+      </w:tr>
+      <w:tr>
+        <w:tc>
+          <w:tcPr>
+            <w:tcW w:w="2340" w:type="dxa"/>
+          </w:tcPr>
+          <w:p>
+            <w:pPr/>
+            <w:r>
+              <w:t xml:space="preserve">Probabilités</w:t>
+            </w:r>
+          </w:p>
+        </w:tc>
+        <w:tc>
+          <w:tcPr>
+            <w:tcW w:w="2340" w:type="dxa"/>
+          </w:tcPr>
+          <w:p>
+            <w:pPr/>
+            <w:r>
+              <w:t xml:space="preserve">28/28/28/15 %</w:t>
+            </w:r>
+          </w:p>
+        </w:tc>
+        <w:tc>
+          <w:tcPr>
+            <w:tcW w:w="2340" w:type="dxa"/>
+          </w:tcPr>
+          <w:p>
+            <w:pPr/>
+            <w:r>
+              <w:rPr>
+                <w:b/>
+              </w:rPr>
+              <w:t xml:space="preserve">28/34/35/2 %</w:t>
+            </w:r>
+          </w:p>
+        </w:tc>
+        <w:tc>
+          <w:tcPr>
+            <w:tcW w:w="2340" w:type="dxa"/>
+          </w:tcPr>
+          <w:p>
+            <w:pPr/>
+            <w:r>
+              <w:t xml:space="preserve">—</w:t>
+            </w:r>
+          </w:p>
+        </w:tc>
+      </w:tr>
+      <w:tr>
+        <w:tc>
+          <w:tcPr>
+            <w:tcW w:w="2340" w:type="dxa"/>
+          </w:tcPr>
+          <w:p>
+            <w:pPr/>
+            <w:r>
+              <w:t xml:space="preserve">Position détenue</w:t>
+            </w:r>
+          </w:p>
+        </w:tc>
+        <w:tc>
+          <w:tcPr>
+            <w:tcW w:w="2340" w:type="dxa"/>
+          </w:tcPr>
+          <w:p>
+            <w:pPr/>
+            <w:r>
+              <w:t xml:space="preserve">—</w:t>
+            </w:r>
+          </w:p>
+        </w:tc>
+        <w:tc>
+          <w:tcPr>
+            <w:tcW w:w="2340" w:type="dxa"/>
+          </w:tcPr>
+          <w:p>
+            <w:pPr/>
+            <w:r>
+              <w:t xml:space="preserve">T1 figé</w:t>
+            </w:r>
+          </w:p>
+        </w:tc>
+        <w:tc>
+          <w:tcPr>
+            <w:tcW w:w="2340" w:type="dxa"/>
+          </w:tcPr>
+          <w:p>
+            <w:pPr/>
+            <w:r>
+              <w:t xml:space="preserve">T1 + T2 figés</w:t>
+            </w:r>
+          </w:p>
+        </w:tc>
+      </w:tr>
+    </w:tbl>
+    <w:p>
+      <w:pPr/>
+      <w:r>
+        <w:rPr>
+          <w:b/>
+        </w:rPr>
+        <w:t xml:space="preserve">Ce qui ne bouge jamais, et c'est volontaire</w:t>
+      </w:r>
+      <w:r>
+        <w:t xml:space="preserve"> : les coefficients de profil Enedis et les gradients (ils décrivent un client, pas un marché), la température normale, les années historiques, la pente </w:t>
+      </w:r>
+      <w:r>
+        <w:rPr>
+          <w:rStyle w:val="CodeChar"/>
+        </w:rPr>
+        <w:t xml:space="preserve">b = +2,451</w:t>
+      </w:r>
+      <w:r>
+        <w:t xml:space="preserve">, et les quatre paramètres du Conseil.</w:t>
+      </w:r>
+    </w:p>
+    <w:p>
+      <w:pPr/>
+      <w:r>
+        <w:t xml:space="preserve">Deux réserves à connaître. </w:t>
+      </w:r>
+      <w:r>
+        <w:rPr>
+          <w:rStyle w:val="CodeChar"/>
+          <w:b/>
+        </w:rPr>
+        <w:t xml:space="preserve">b</w:t>
+      </w:r>
+      <w:r>
+        <w:rPr>
+          <w:b/>
+        </w:rPr>
+        <w:t xml:space="preserve"> n'est jamais réestimé</w:t>
+      </w:r>
+      <w:r>
+        <w:t xml:space="preserve"> : calculé une fois sur 454 jours d'hiver, il ne tient pas compte de l'hiver 2026. Défendable, puisqu'il décrit une relation structurelle et non un prix. Et </w:t>
+      </w:r>
+      <w:r>
+        <w:rPr>
+          <w:b/>
+        </w:rPr>
+        <w:t xml:space="preserve">au T3 les scénarios ne sont pas ré-ancrés sur 78,37</w:t>
+      </w:r>
+      <w:r>
+        <w:t xml:space="preserve"> : </w:t>
+      </w:r>
+      <w:r>
+        <w:rPr>
+          <w:rStyle w:val="CodeChar"/>
+        </w:rPr>
+        <w:t xml:space="preserve">spot_t3.py</w:t>
+      </w:r>
+      <w:r>
+        <w:t xml:space="preserve"> raisonne sur le volume à température normale et les prix réels, ce qui en fait un </w:t>
+      </w:r>
+      <w:r>
+        <w:rPr>
+          <w:b/>
+        </w:rPr>
+        <w:t xml:space="preserve">rééquilibrage de volume</w:t>
+      </w:r>
+      <w:r>
+        <w:t xml:space="preserve"> et non une ré-optimisation de marge. C'est la lecture littérale de l'objectif 1 (</w:t>
+      </w:r>
+      <w:r>
+        <w:rPr>
+          <w:i/>
+        </w:rPr>
+        <w:t xml:space="preserve">evaluate what you should buy/sell</w:t>
+      </w:r>
+      <w:r>
+        <w:t xml:space="preserve">), pas une décision à la façon du §4.4.</w:t>
+      </w:r>
+    </w:p>
+    <w:p>
+      <w:pPr>
         <w:pStyle w:val="Heading2"/>
       </w:pPr>
       <w:r>
@@ -11090,6 +12666,453 @@
       </w:r>
       <w:r>
         <w:t xml:space="preserve">. Notre 70/20/10 est celle qui protège le mieux.</w:t>
+      </w:r>
+    </w:p>
+    <w:p>
+      <w:pPr>
+        <w:pStyle w:val="Heading3"/>
+      </w:pPr>
+      <w:r>
+        <w:t xml:space="preserve">Toutes les stratégies testées</w:t>
+      </w:r>
+    </w:p>
+    <w:p>
+      <w:pPr/>
+      <w:r>
+        <w:rPr>
+          <w:b/>
+        </w:rPr>
+        <w:t xml:space="preserve">A, B, C et D ne sont pas de nous</w:t>
+      </w:r>
+      <w:r>
+        <w:t xml:space="preserve"> : ce sont les quatre exemples du prof, session 4 page 27, repris avec ses noms et ses ratios. Les guidelines réclament « au moins deux » stratégies suffisamment différentes, en citant 40/40 contre 50/40 contre 40/60 — soit littéralement B, A et C.</w:t>
+      </w:r>
+    </w:p>
+    <w:p>
+      <w:pPr/>
+      <w:r>
+        <w:rPr>
+          <w:b/>
+        </w:rPr>
+        <w:t xml:space="preserve">Au-delà des six du tableau, le code a balayé 31 combinaisons</w:t>
+      </w:r>
+      <w:r>
+        <w:t xml:space="preserve"> (T1 de 0 à 100 % par pas de 10, avec complément à 90 % puis à 100 %). Les plus parlantes :</w:t>
+      </w:r>
+    </w:p>
+    <w:tbl>
+      <w:tblPr>
+        <w:tblStyle w:val="TableGrid"/>
+        <w:tblW w:w="0" w:type="auto"/>
+        <w:tblLayout w:type="fixed"/>
+        <w:tblLook w:val="04A0" w:firstRow="1" w:lastRow="0" w:firstColumn="0" w:lastColumn="0" w:noHBand="0" w:noVBand="1"/>
+      </w:tblPr>
+      <w:tblGrid>
+        <w:gridCol w:w="3120"/>
+        <w:gridCol w:w="3120"/>
+        <w:gridCol w:w="3120"/>
+      </w:tblGrid>
+      <w:tr>
+        <w:trPr>
+          <w:tblHeader/>
+        </w:trPr>
+        <w:tc>
+          <w:tcPr>
+            <w:tcW w:w="3120" w:type="dxa"/>
+            <w:shd w:val="clear" w:color="auto" w:fill="F2F2F2"/>
+          </w:tcPr>
+          <w:p>
+            <w:pPr/>
+          </w:p>
+        </w:tc>
+        <w:tc>
+          <w:tcPr>
+            <w:tcW w:w="3120" w:type="dxa"/>
+            <w:shd w:val="clear" w:color="auto" w:fill="F2F2F2"/>
+          </w:tcPr>
+          <w:p>
+            <w:pPr/>
+            <w:r>
+              <w:t xml:space="preserve">Espérance</w:t>
+            </w:r>
+          </w:p>
+        </w:tc>
+        <w:tc>
+          <w:tcPr>
+            <w:tcW w:w="3120" w:type="dxa"/>
+            <w:shd w:val="clear" w:color="auto" w:fill="F2F2F2"/>
+          </w:tcPr>
+          <w:p>
+            <w:pPr/>
+            <w:r>
+              <w:t xml:space="preserve">Pire cas</w:t>
+            </w:r>
+          </w:p>
+        </w:tc>
+      </w:tr>
+      <w:tr>
+        <w:tc>
+          <w:tcPr>
+            <w:tcW w:w="3120" w:type="dxa"/>
+          </w:tcPr>
+          <w:p>
+            <w:pPr/>
+            <w:r>
+              <w:t xml:space="preserve">100 / 0 / 0</w:t>
+            </w:r>
+          </w:p>
+        </w:tc>
+        <w:tc>
+          <w:tcPr>
+            <w:tcW w:w="3120" w:type="dxa"/>
+          </w:tcPr>
+          <w:p>
+            <w:pPr/>
+            <w:r>
+              <w:t xml:space="preserve">3,46</w:t>
+            </w:r>
+          </w:p>
+        </w:tc>
+        <w:tc>
+          <w:tcPr>
+            <w:tcW w:w="3120" w:type="dxa"/>
+          </w:tcPr>
+          <w:p>
+            <w:pPr/>
+            <w:r>
+              <w:rPr>
+                <w:b/>
+              </w:rPr>
+              <w:t xml:space="preserve">1,93</w:t>
+            </w:r>
+            <w:r>
+              <w:t xml:space="preserve"> ← meilleure protection</w:t>
+            </w:r>
+          </w:p>
+        </w:tc>
+      </w:tr>
+      <w:tr>
+        <w:tc>
+          <w:tcPr>
+            <w:tcW w:w="3120" w:type="dxa"/>
+          </w:tcPr>
+          <w:p>
+            <w:pPr/>
+            <w:r>
+              <w:t xml:space="preserve">90 / 10 / 0</w:t>
+            </w:r>
+          </w:p>
+        </w:tc>
+        <w:tc>
+          <w:tcPr>
+            <w:tcW w:w="3120" w:type="dxa"/>
+          </w:tcPr>
+          <w:p>
+            <w:pPr/>
+            <w:r>
+              <w:t xml:space="preserve">3,78</w:t>
+            </w:r>
+          </w:p>
+        </w:tc>
+        <w:tc>
+          <w:tcPr>
+            <w:tcW w:w="3120" w:type="dxa"/>
+          </w:tcPr>
+          <w:p>
+            <w:pPr/>
+            <w:r>
+              <w:t xml:space="preserve">1,43</w:t>
+            </w:r>
+          </w:p>
+        </w:tc>
+      </w:tr>
+      <w:tr>
+        <w:tc>
+          <w:tcPr>
+            <w:tcW w:w="3120" w:type="dxa"/>
+          </w:tcPr>
+          <w:p>
+            <w:pPr/>
+            <w:r>
+              <w:t xml:space="preserve">90 / 5 / 5</w:t>
+            </w:r>
+          </w:p>
+        </w:tc>
+        <w:tc>
+          <w:tcPr>
+            <w:tcW w:w="3120" w:type="dxa"/>
+          </w:tcPr>
+          <w:p>
+            <w:pPr/>
+            <w:r>
+              <w:t xml:space="preserve">3,83</w:t>
+            </w:r>
+          </w:p>
+        </w:tc>
+        <w:tc>
+          <w:tcPr>
+            <w:tcW w:w="3120" w:type="dxa"/>
+          </w:tcPr>
+          <w:p>
+            <w:pPr/>
+            <w:r>
+              <w:t xml:space="preserve">1,09</w:t>
+            </w:r>
+          </w:p>
+        </w:tc>
+      </w:tr>
+      <w:tr>
+        <w:tc>
+          <w:tcPr>
+            <w:tcW w:w="3120" w:type="dxa"/>
+          </w:tcPr>
+          <w:p>
+            <w:pPr/>
+            <w:r>
+              <w:t xml:space="preserve">80 / 10 / 10</w:t>
+            </w:r>
+          </w:p>
+        </w:tc>
+        <w:tc>
+          <w:tcPr>
+            <w:tcW w:w="3120" w:type="dxa"/>
+          </w:tcPr>
+          <w:p>
+            <w:pPr/>
+            <w:r>
+              <w:t xml:space="preserve">4,19</w:t>
+            </w:r>
+          </w:p>
+        </w:tc>
+        <w:tc>
+          <w:tcPr>
+            <w:tcW w:w="3120" w:type="dxa"/>
+          </w:tcPr>
+          <w:p>
+            <w:pPr/>
+            <w:r>
+              <w:t xml:space="preserve">0,26</w:t>
+            </w:r>
+          </w:p>
+        </w:tc>
+      </w:tr>
+      <w:tr>
+        <w:tc>
+          <w:tcPr>
+            <w:tcW w:w="3120" w:type="dxa"/>
+          </w:tcPr>
+          <w:p>
+            <w:pPr/>
+            <w:r>
+              <w:t xml:space="preserve">70 / 30 / 0</w:t>
+            </w:r>
+          </w:p>
+        </w:tc>
+        <w:tc>
+          <w:tcPr>
+            <w:tcW w:w="3120" w:type="dxa"/>
+          </w:tcPr>
+          <w:p>
+            <w:pPr/>
+            <w:r>
+              <w:t xml:space="preserve">4,41</w:t>
+            </w:r>
+          </w:p>
+        </w:tc>
+        <w:tc>
+          <w:tcPr>
+            <w:tcW w:w="3120" w:type="dxa"/>
+          </w:tcPr>
+          <w:p>
+            <w:pPr/>
+            <w:r>
+              <w:t xml:space="preserve">0,43</w:t>
+            </w:r>
+          </w:p>
+        </w:tc>
+      </w:tr>
+      <w:tr>
+        <w:tc>
+          <w:tcPr>
+            <w:tcW w:w="3120" w:type="dxa"/>
+          </w:tcPr>
+          <w:p>
+            <w:pPr/>
+            <w:r>
+              <w:t xml:space="preserve">60 / 30 / 10</w:t>
+            </w:r>
+          </w:p>
+        </w:tc>
+        <w:tc>
+          <w:tcPr>
+            <w:tcW w:w="3120" w:type="dxa"/>
+          </w:tcPr>
+          <w:p>
+            <w:pPr/>
+            <w:r>
+              <w:t xml:space="preserve">4,83</w:t>
+            </w:r>
+          </w:p>
+        </w:tc>
+        <w:tc>
+          <w:tcPr>
+            <w:tcW w:w="3120" w:type="dxa"/>
+          </w:tcPr>
+          <w:p>
+            <w:pPr/>
+            <w:r>
+              <w:t xml:space="preserve">−0,74</w:t>
+            </w:r>
+          </w:p>
+        </w:tc>
+      </w:tr>
+      <w:tr>
+        <w:tc>
+          <w:tcPr>
+            <w:tcW w:w="3120" w:type="dxa"/>
+          </w:tcPr>
+          <w:p>
+            <w:pPr/>
+            <w:r>
+              <w:t xml:space="preserve">50 / 50 / 0</w:t>
+            </w:r>
+          </w:p>
+        </w:tc>
+        <w:tc>
+          <w:tcPr>
+            <w:tcW w:w="3120" w:type="dxa"/>
+          </w:tcPr>
+          <w:p>
+            <w:pPr/>
+            <w:r>
+              <w:t xml:space="preserve">5,05</w:t>
+            </w:r>
+          </w:p>
+        </w:tc>
+        <w:tc>
+          <w:tcPr>
+            <w:tcW w:w="3120" w:type="dxa"/>
+          </w:tcPr>
+          <w:p>
+            <w:pPr/>
+            <w:r>
+              <w:t xml:space="preserve">−0,57</w:t>
+            </w:r>
+          </w:p>
+        </w:tc>
+      </w:tr>
+      <w:tr>
+        <w:tc>
+          <w:tcPr>
+            <w:tcW w:w="3120" w:type="dxa"/>
+          </w:tcPr>
+          <w:p>
+            <w:pPr/>
+            <w:r>
+              <w:t xml:space="preserve">0 / 0 / 100</w:t>
+            </w:r>
+          </w:p>
+        </w:tc>
+        <w:tc>
+          <w:tcPr>
+            <w:tcW w:w="3120" w:type="dxa"/>
+          </w:tcPr>
+          <w:p>
+            <w:pPr/>
+            <w:r>
+              <w:rPr>
+                <w:b/>
+              </w:rPr>
+              <w:t xml:space="preserve">7,60</w:t>
+            </w:r>
+            <w:r>
+              <w:t xml:space="preserve"> ← meilleure espérance</w:t>
+            </w:r>
+          </w:p>
+        </w:tc>
+        <w:tc>
+          <w:tcPr>
+            <w:tcW w:w="3120" w:type="dxa"/>
+          </w:tcPr>
+          <w:p>
+            <w:pPr/>
+            <w:r>
+              <w:t xml:space="preserve">−9,84</w:t>
+            </w:r>
+          </w:p>
+        </w:tc>
+      </w:tr>
+    </w:tbl>
+    <w:p>
+      <w:pPr/>
+      <w:r>
+        <w:t xml:space="preserve">La relation est </w:t>
+      </w:r>
+      <w:r>
+        <w:rPr>
+          <w:b/>
+        </w:rPr>
+        <w:t xml:space="preserve">strictement monotone</w:t>
+      </w:r>
+      <w:r>
+        <w:t xml:space="preserve"> sur les 31, et aucune ne tient le plancher.</w:t>
+      </w:r>
+    </w:p>
+    <w:p>
+      <w:pPr/>
+      <w:r>
+        <w:t xml:space="preserve">Trois autres dimensions ont été testées : le </w:t>
+      </w:r>
+      <w:r>
+        <w:rPr>
+          <w:b/>
+        </w:rPr>
+        <w:t xml:space="preserve">mix de produits</w:t>
+      </w:r>
+      <w:r>
+        <w:t xml:space="preserve"> à couverture égale (cal 83,31 · trimestres 87,55 · trimestres+peak 89,11 €/MWh), les </w:t>
+      </w:r>
+      <w:r>
+        <w:rPr>
+          <w:b/>
+        </w:rPr>
+        <w:t xml:space="preserve">sept options du T2</w:t>
+      </w:r>
+      <w:r>
+        <w:t xml:space="preserve"> (ne rien acheter, compléter à 85 / 90 / 100 %, chacune en Cal et en trimestres) et les quatre </w:t>
+      </w:r>
+      <w:r>
+        <w:rPr>
+          <w:b/>
+        </w:rPr>
+        <w:t xml:space="preserve">tests de sensibilité</w:t>
+      </w:r>
+      <w:r>
+        <w:t xml:space="preserve"> (plancher, </w:t>
+      </w:r>
+      <w:r>
+        <w:rPr>
+          <w:rStyle w:val="CodeChar"/>
+        </w:rPr>
+        <w:t xml:space="preserve">b</w:t>
+      </w:r>
+      <w:r>
+        <w:t xml:space="preserve">, α, mix).</w:t>
+      </w:r>
+    </w:p>
+    <w:p>
+      <w:pPr/>
+      <w:r>
+        <w:t xml:space="preserve">Le point à retenir pour l'oral : notre 70/20/10 n'a pas la meilleure espérance, mais </w:t>
+      </w:r>
+      <w:r>
+        <w:rPr>
+          <w:b/>
+        </w:rPr>
+        <w:t xml:space="preserve">le meilleur pire cas des six</w:t>
+      </w:r>
+      <w:r>
+        <w:t xml:space="preserve">, et ce classement ne bouge sur aucun des quatre tests.</w:t>
       </w:r>
     </w:p>
     <w:p>

</xml_diff>

<commit_message>
Trois graphiques dans le document explicatif
- etape 12 : esperance contre pire cas des six strategies, avec la ligne du
  plancher du Conseil. L'ecart entre le meilleur point et la ligne montre
  que ce ne sont pas quelques dixiemes qui manquent, mais plus de 5 EUR/MWh.
- etape 15 : position ouverte du 1er janvier heure par heure, barres au-dessus
  et au-dessous de zero. C'est le graphique que le paragraphe 5.2 reclame.
- etape 15 : prix EEX Base aux trois jalons, une courbe par produit. L'hiver
  porte toute la volatilite.

Exports Word et PDF regeneres (revision 36) : 42 pages, graphiques inclus.

Co-Authored-By: Claude Opus 5 <noreply@anthropic.com>
Claude-Session: https://claude.ai/code/session_01RNL6Jhn5rE1VVnxEKFCFYa
</commit_message>
<xml_diff>
--- a/MarketGame/Version Light/export/Market Game 2027 - comprendre le code etape par etape.docx
+++ b/MarketGame/Version Light/export/Market Game 2027 - comprendre le code etape par etape.docx
@@ -12647,6 +12647,72 @@
     <w:p>
       <w:pPr/>
       <w:r>
+        <w:drawing>
+          <wp:inline distT="0" distB="0" distL="0" distR="0">
+            <wp:extent cx="5486400" cy="3086100"/>
+            <wp:docPr id="2" name="image2" descr="sortie de comparaison_scenarios.py · 6 stratégies, 4 scénarios"/>
+            <a:graphic xmlns:a="http://schemas.openxmlformats.org/drawingml/2006/main">
+              <a:graphicData uri="http://schemas.openxmlformats.org/drawingml/2006/picture">
+                <pic:pic xmlns:pic="http://schemas.openxmlformats.org/drawingml/2006/picture">
+                  <pic:nvPicPr>
+                    <pic:cNvPr id="2" name="image2" descr="sortie de comparaison_scenarios.py · 6 stratégies, 4 scénarios"/>
+                    <pic:cNvPicPr/>
+                  </pic:nvPicPr>
+                  <pic:blipFill>
+                    <a:blip r:embed="rId4"/>
+                    <a:stretch>
+                      <a:fillRect/>
+                    </a:stretch>
+                  </pic:blipFill>
+                  <pic:spPr>
+                    <a:xfrm>
+                      <a:off x="0" y="0"/>
+                      <a:ext cx="5486400" cy="3086100"/>
+                    </a:xfrm>
+                    <a:prstGeom prst="rect">
+                      <a:avLst/>
+                    </a:prstGeom>
+                  </pic:spPr>
+                </pic:pic>
+              </a:graphicData>
+            </a:graphic>
+          </wp:inline>
+        </w:drawing>
+      </w:r>
+    </w:p>
+    <w:p>
+      <w:pPr/>
+      <w:r>
+        <w:t xml:space="preserve">sortie de comparaison_scenarios.py · 6 stratégies, 4 scénarios</w:t>
+      </w:r>
+    </w:p>
+    <w:p>
+      <w:pPr/>
+      <w:r>
+        <w:t xml:space="preserve">Les six points se rangent sur une diagonale descendante : </w:t>
+      </w:r>
+      <w:r>
+        <w:rPr>
+          <w:b/>
+        </w:rPr>
+        <w:t xml:space="preserve">gagner en espérance se paie exactement en pire cas</w:t>
+      </w:r>
+      <w:r>
+        <w:t xml:space="preserve">. Notre 70/20/10 est le plus à gauche et le plus haut — la moins rentable en moyenne, la mieux protégée. Et l'écart entre le meilleur point et la ligne du plancher montre l'ampleur du problème : il ne manque pas quelques dixièmes, il manque </w:t>
+      </w:r>
+      <w:r>
+        <w:rPr>
+          <w:b/>
+        </w:rPr>
+        <w:t xml:space="preserve">plus de 5 €/MWh</w:t>
+      </w:r>
+      <w:r>
+        <w:t xml:space="preserve">.</w:t>
+      </w:r>
+    </w:p>
+    <w:p>
+      <w:pPr/>
+      <w:r>
         <w:t xml:space="preserve">La relation est </w:t>
       </w:r>
       <w:r>
@@ -16450,6 +16516,63 @@
       <w:pPr/>
       <w:r>
         <w:t xml:space="preserve">Le Q1-27 reprend 12 % en un mois : le marché anticipe un janvier froid, ce que la prévision de température confirmera.</w:t>
+      </w:r>
+    </w:p>
+    <w:p>
+      <w:pPr/>
+      <w:r>
+        <w:drawing>
+          <wp:inline distT="0" distB="0" distL="0" distR="0">
+            <wp:extent cx="5486400" cy="2939142"/>
+            <wp:docPr id="3" name="image3" descr="fichiers EEX du prof · prix de règlement Base aux trois jalons"/>
+            <a:graphic xmlns:a="http://schemas.openxmlformats.org/drawingml/2006/main">
+              <a:graphicData uri="http://schemas.openxmlformats.org/drawingml/2006/picture">
+                <pic:pic xmlns:pic="http://schemas.openxmlformats.org/drawingml/2006/picture">
+                  <pic:nvPicPr>
+                    <pic:cNvPr id="3" name="image3" descr="fichiers EEX du prof · prix de règlement Base aux trois jalons"/>
+                    <pic:cNvPicPr/>
+                  </pic:nvPicPr>
+                  <pic:blipFill>
+                    <a:blip r:embed="rId5"/>
+                    <a:stretch>
+                      <a:fillRect/>
+                    </a:stretch>
+                  </pic:blipFill>
+                  <pic:spPr>
+                    <a:xfrm>
+                      <a:off x="0" y="0"/>
+                      <a:ext cx="5486400" cy="2939142"/>
+                    </a:xfrm>
+                    <a:prstGeom prst="rect">
+                      <a:avLst/>
+                    </a:prstGeom>
+                  </pic:spPr>
+                </pic:pic>
+              </a:graphicData>
+            </a:graphic>
+          </wp:inline>
+        </w:drawing>
+      </w:r>
+    </w:p>
+    <w:p>
+      <w:pPr/>
+      <w:r>
+        <w:t xml:space="preserve">fichiers EEX du prof · prix de règlement Base aux trois jalons</w:t>
+      </w:r>
+    </w:p>
+    <w:p>
+      <w:pPr/>
+      <w:r>
+        <w:t xml:space="preserve">Toutes les courbes font le même V : baisse jusqu'au 1er décembre, remontée en fin de mois. Mais </w:t>
+      </w:r>
+      <w:r>
+        <w:rPr>
+          <w:b/>
+        </w:rPr>
+        <w:t xml:space="preserve">l'amplitude est très inégale</w:t>
+      </w:r>
+      <w:r>
+        <w:t xml:space="preserve"> — le Q1-27 perd puis reprend une vingtaine d'euros quand le Q2-27 bouge à peine de trois. C'est l'hiver qui porte toute la volatilité, et c'est précisément là que notre couverture était la plus faible.</w:t>
       </w:r>
     </w:p>
     <w:p>
@@ -17938,6 +18061,81 @@
       </w:r>
       <w:r>
         <w:t xml:space="preserve">.</w:t>
+      </w:r>
+    </w:p>
+    <w:p>
+      <w:pPr/>
+      <w:r>
+        <w:drawing>
+          <wp:inline distT="0" distB="0" distL="0" distR="0">
+            <wp:extent cx="5486400" cy="2792185"/>
+            <wp:docPr id="4" name="image4" descr="sortie de spot_t3.py · 24 heures du 01/01/2027, température prévue et solaire déduit"/>
+            <a:graphic xmlns:a="http://schemas.openxmlformats.org/drawingml/2006/main">
+              <a:graphicData uri="http://schemas.openxmlformats.org/drawingml/2006/picture">
+                <pic:pic xmlns:pic="http://schemas.openxmlformats.org/drawingml/2006/picture">
+                  <pic:nvPicPr>
+                    <pic:cNvPr id="4" name="image4" descr="sortie de spot_t3.py · 24 heures du 01/01/2027, température prévue et solaire déduit"/>
+                    <pic:cNvPicPr/>
+                  </pic:nvPicPr>
+                  <pic:blipFill>
+                    <a:blip r:embed="rId6"/>
+                    <a:stretch>
+                      <a:fillRect/>
+                    </a:stretch>
+                  </pic:blipFill>
+                  <pic:spPr>
+                    <a:xfrm>
+                      <a:off x="0" y="0"/>
+                      <a:ext cx="5486400" cy="2792185"/>
+                    </a:xfrm>
+                    <a:prstGeom prst="rect">
+                      <a:avLst/>
+                    </a:prstGeom>
+                  </pic:spPr>
+                </pic:pic>
+              </a:graphicData>
+            </a:graphic>
+          </wp:inline>
+        </w:drawing>
+      </w:r>
+    </w:p>
+    <w:p>
+      <w:pPr/>
+      <w:r>
+        <w:t xml:space="preserve">sortie de spot_t3.py · 24 heures du 01/01/2027, température prévue et solaire déduit</w:t>
+      </w:r>
+    </w:p>
+    <w:p>
+      <w:pPr/>
+      <w:r>
+        <w:t xml:space="preserve">C'est le graphique que le §5.2 réclame : </w:t>
+      </w:r>
+      <w:r>
+        <w:rPr>
+          <w:i/>
+        </w:rPr>
+        <w:t xml:space="preserve">bars above zero for the hours to buy, below zero for the hours to sell</w:t>
+      </w:r>
+      <w:r>
+        <w:t xml:space="preserve">. La forme raconte tout le problème du ruban plat — </w:t>
+      </w:r>
+      <w:r>
+        <w:rPr>
+          <w:b/>
+        </w:rPr>
+        <w:t xml:space="preserve">long de minuit à 8 h</w:t>
+      </w:r>
+      <w:r>
+        <w:t xml:space="preserve">, quand la couverture de 64 MW dépasse une charge creuse, puis </w:t>
+      </w:r>
+      <w:r>
+        <w:rPr>
+          <w:b/>
+        </w:rPr>
+        <w:t xml:space="preserve">de plus en plus court à mesure que la soirée monte</w:t>
+      </w:r>
+      <w:r>
+        <w:t xml:space="preserve">, jusqu'à 50 MW à 19 h. Le léger repli de 12 h à 14 h est le solaire : 24 MWh à midi effacent une partie du besoin, et le trou se referme dès que le soleil baisse.</w:t>
       </w:r>
     </w:p>
     <w:p>

</xml_diff>

<commit_message>
Rapport : remplacer les graphes dessines par les figures matplotlib du code
Les sept figures du rapport sortent desormais telles quelles des scripts,
sans retouche :
  - courbe de charge 2027 sur l'annee et sur une semaine d'hiver
  - 1er janvier 2027, vendredi ferie (preuve de l'appariement par type de jour)
  - scenario 2021 : charge, spot, cout journalier
  - comparaison des quatre scenarios
  - charge, couverture et position ouverte au T2 puis au T3

Ajouts :
  - figures.py rejoue les cinq scripts et enregistre les PNG dans export/figures/
    (il remplace seulement plt.show par savefig, il ne touche a aucun calcul)
  - export/figures/ : les sept PNG
  - exports Word et PDF regeneres avec les figures (31 pages)

Les trois graphiques dessines a la main dans le document sont retires.

Co-Authored-By: Claude Opus 5 <noreply@anthropic.com>
Claude-Session: https://claude.ai/code/session_01RNL6Jhn5rE1VVnxEKFCFYa
</commit_message>
<xml_diff>
--- a/MarketGame/Version Light/export/Market Game 2027 - comprendre le code etape par etape.docx
+++ b/MarketGame/Version Light/export/Market Game 2027 - comprendre le code etape par etape.docx
@@ -2794,6 +2794,63 @@
       </w:r>
     </w:p>
     <w:p>
+      <w:pPr/>
+      <w:r>
+        <w:rPr>
+          <w:b/>
+        </w:rPr>
+        <w:t xml:space="preserve">Les figures</w:t>
+      </w:r>
+      <w:r>
+        <w:t xml:space="preserve"> : chaque script se termine par un appel à </w:t>
+      </w:r>
+      <w:r>
+        <w:rPr>
+          <w:rStyle w:val="CodeChar"/>
+        </w:rPr>
+        <w:t xml:space="preserve">tracer()</w:t>
+      </w:r>
+      <w:r>
+        <w:t xml:space="preserve"> et ouvre ses figures matplotlib à l'écran quand on le lance. Les sept figures reproduites dans ce document sortent telles quelles de ces appels, sans retouche. </w:t>
+      </w:r>
+      <w:r>
+        <w:rPr>
+          <w:rStyle w:val="CodeChar"/>
+        </w:rPr>
+        <w:t xml:space="preserve">figures.py</w:t>
+      </w:r>
+      <w:r>
+        <w:t xml:space="preserve">, dans le même dossier, rejoue les cinq scripts et enregistre les sept PNG dans </w:t>
+      </w:r>
+      <w:r>
+        <w:rPr>
+          <w:rStyle w:val="CodeChar"/>
+        </w:rPr>
+        <w:t xml:space="preserve">export/figures/</w:t>
+      </w:r>
+      <w:r>
+        <w:t xml:space="preserve"> — il n'ajoute rien, il remplace seulement </w:t>
+      </w:r>
+      <w:r>
+        <w:rPr>
+          <w:rStyle w:val="CodeChar"/>
+        </w:rPr>
+        <w:t xml:space="preserve">plt.show()</w:t>
+      </w:r>
+      <w:r>
+        <w:t xml:space="preserve"> par un </w:t>
+      </w:r>
+      <w:r>
+        <w:rPr>
+          <w:rStyle w:val="CodeChar"/>
+        </w:rPr>
+        <w:t xml:space="preserve">savefig()</w:t>
+      </w:r>
+      <w:r>
+        <w:t xml:space="preserve">.</w:t>
+      </w:r>
+    </w:p>
+    <w:p>
       <w:pPr>
         <w:pStyle w:val="Heading3"/>
       </w:pPr>
@@ -6950,6 +7007,164 @@
       </w:tr>
     </w:tbl>
     <w:p>
+      <w:pPr>
+        <w:pStyle w:val="Heading3"/>
+      </w:pPr>
+      <w:r>
+        <w:t xml:space="preserve">Les figures que trace le fichier</w:t>
+      </w:r>
+    </w:p>
+    <w:p>
+      <w:pPr/>
+      <w:r>
+        <w:rPr>
+          <w:rStyle w:val="CodeChar"/>
+        </w:rPr>
+        <w:t xml:space="preserve">Modelisation_Conso.py</w:t>
+      </w:r>
+      <w:r>
+        <w:t xml:space="preserve"> trace trois figures quand on le lance. Elles ne servent pas à décorer : elles servent à vérifier d'un coup d'œil que la charge a la bonne tête, avant de calculer quoi que ce soit dessus.</w:t>
+      </w:r>
+    </w:p>
+    <w:p>
+      <w:pPr/>
+      <w:r>
+        <w:drawing>
+          <wp:inline distT="0" distB="0" distL="0" distR="0">
+            <wp:extent cx="5486400" cy="3892789"/>
+            <wp:docPr id="2" name="image2"/>
+            <a:graphic xmlns:a="http://schemas.openxmlformats.org/drawingml/2006/main">
+              <a:graphicData uri="http://schemas.openxmlformats.org/drawingml/2006/picture">
+                <pic:pic xmlns:pic="http://schemas.openxmlformats.org/drawingml/2006/picture">
+                  <pic:nvPicPr>
+                    <pic:cNvPr id="2" name="image2"/>
+                    <pic:cNvPicPr/>
+                  </pic:nvPicPr>
+                  <pic:blipFill>
+                    <a:blip r:embed="rIdFig2"/>
+                    <a:stretch>
+                      <a:fillRect/>
+                    </a:stretch>
+                  </pic:blipFill>
+                  <pic:spPr>
+                    <a:xfrm>
+                      <a:off x="0" y="0"/>
+                      <a:ext cx="5486400" cy="3892789"/>
+                    </a:xfrm>
+                    <a:prstGeom prst="rect">
+                      <a:avLst/>
+                    </a:prstGeom>
+                  </pic:spPr>
+                </pic:pic>
+              </a:graphicData>
+            </a:graphic>
+          </wp:inline>
+        </w:drawing>
+      </w:r>
+    </w:p>
+    <w:p>
+      <w:pPr/>
+      <w:r>
+        <w:rPr>
+          <w:b/>
+        </w:rPr>
+        <w:t xml:space="preserve">L'année entière</w:t>
+      </w:r>
+      <w:r>
+        <w:t xml:space="preserve">, 17 520 points par profil. Le trait paraît épais parce que chaque journée monte et redescend d'environ 40 MW : à cette échelle, l'œil ne voit que l'enveloppe. Trois choses s'y lisent. </w:t>
+      </w:r>
+      <w:r>
+        <w:rPr>
+          <w:b/>
+        </w:rPr>
+        <w:t xml:space="preserve">La saisonnalité</w:t>
+      </w:r>
+      <w:r>
+        <w:t xml:space="preserve"> : le total culmine au-dessus de 115 MW début janvier et retombe dans une bande de 35 à 70 MW en août — c'est la thermosensibilité de l'étape 4, et comme aucun des deux profils n'a de climatisation, l'été est un plancher, pas un deuxième pic. </w:t>
+      </w:r>
+      <w:r>
+        <w:rPr>
+          <w:b/>
+        </w:rPr>
+        <w:t xml:space="preserve">Le poids relatif des deux profils</w:t>
+      </w:r>
+      <w:r>
+        <w:t xml:space="preserve"> : RES1 tient l'essentiel (20 à 93 MW), PRO1 complète (5 à 33 MW). </w:t>
+      </w:r>
+      <w:r>
+        <w:rPr>
+          <w:b/>
+        </w:rPr>
+        <w:t xml:space="preserve">Le resserrement d'avril à octobre</w:t>
+      </w:r>
+      <w:r>
+        <w:t xml:space="preserve"> : c'est la période où </w:t>
+      </w:r>
+      <w:r>
+        <w:rPr>
+          <w:rStyle w:val="CodeChar"/>
+        </w:rPr>
+        <w:t xml:space="preserve">g = 0</w:t>
+      </w:r>
+      <w:r>
+        <w:t xml:space="preserve"> et où CM vaut exactement 1 ; toute la variabilité qui reste vient du calendrier, plus de la météo.</w:t>
+      </w:r>
+    </w:p>
+    <w:p>
+      <w:pPr/>
+      <w:r>
+        <w:drawing>
+          <wp:inline distT="0" distB="0" distL="0" distR="0">
+            <wp:extent cx="5486400" cy="3879885"/>
+            <wp:docPr id="3" name="image3"/>
+            <a:graphic xmlns:a="http://schemas.openxmlformats.org/drawingml/2006/main">
+              <a:graphicData uri="http://schemas.openxmlformats.org/drawingml/2006/picture">
+                <pic:pic xmlns:pic="http://schemas.openxmlformats.org/drawingml/2006/picture">
+                  <pic:nvPicPr>
+                    <pic:cNvPr id="3" name="image3"/>
+                    <pic:cNvPicPr/>
+                  </pic:nvPicPr>
+                  <pic:blipFill>
+                    <a:blip r:embed="rIdFig3"/>
+                    <a:stretch>
+                      <a:fillRect/>
+                    </a:stretch>
+                  </pic:blipFill>
+                  <pic:spPr>
+                    <a:xfrm>
+                      <a:off x="0" y="0"/>
+                      <a:ext cx="5486400" cy="3879885"/>
+                    </a:xfrm>
+                    <a:prstGeom prst="rect">
+                      <a:avLst/>
+                    </a:prstGeom>
+                  </pic:spPr>
+                </pic:pic>
+              </a:graphicData>
+            </a:graphic>
+          </wp:inline>
+        </w:drawing>
+      </w:r>
+    </w:p>
+    <w:p>
+      <w:pPr/>
+      <w:r>
+        <w:rPr>
+          <w:b/>
+        </w:rPr>
+        <w:t xml:space="preserve">Une semaine d'hiver</w:t>
+      </w:r>
+      <w:r>
+        <w:t xml:space="preserve"> (lundi 11 au dimanche 17 janvier 2027) : la même courbe, dézoomée. C'est là que la forme Enedis devient lisible, et que la différence entre les deux profils saute aux yeux. RES1 fait deux bosses par jour — une le matin, une plus haute le soir qui monte à 90 MW — et retombe à 31 MW entre 3h et 6h. PRO1 fait un plateau de bureau : montée brutale vers 7h, 25 à 30 MW toute la journée, retour à 14 MW le soir. Le week-end, les deux divergent franchement : samedi et dimanche, PRO1 plafonne à 24 puis 17 MW, pendant que RES1 garde des pointes de 80 à 90 MW.</w:t>
+      </w:r>
+    </w:p>
+    <w:p>
+      <w:pPr/>
+      <w:r>
+        <w:t xml:space="preserve">Ce décalage est exactement ce que mesure le ratio peak / off-peak du paragraphe suivant.</w:t>
+      </w:r>
+    </w:p>
+    <w:p>
       <w:pPr/>
       <w:r>
         <w:rPr>
@@ -7601,6 +7816,102 @@
         <w:t xml:space="preserve">bloc = src.iloc[:n].copy()</w:t>
         <w:br/>
         <w:t xml:space="preserve">bloc.index = pd.DatetimeIndex(lignes)</w:t>
+      </w:r>
+    </w:p>
+    <w:p>
+      <w:pPr/>
+      <w:r>
+        <w:drawing>
+          <wp:inline distT="0" distB="0" distL="0" distR="0">
+            <wp:extent cx="5486400" cy="3890632"/>
+            <wp:docPr id="4" name="image4"/>
+            <a:graphic xmlns:a="http://schemas.openxmlformats.org/drawingml/2006/main">
+              <a:graphicData uri="http://schemas.openxmlformats.org/drawingml/2006/picture">
+                <pic:pic xmlns:pic="http://schemas.openxmlformats.org/drawingml/2006/picture">
+                  <pic:nvPicPr>
+                    <pic:cNvPr id="4" name="image4"/>
+                    <pic:cNvPicPr/>
+                  </pic:nvPicPr>
+                  <pic:blipFill>
+                    <a:blip r:embed="rIdFig4"/>
+                    <a:stretch>
+                      <a:fillRect/>
+                    </a:stretch>
+                  </pic:blipFill>
+                  <pic:spPr>
+                    <a:xfrm>
+                      <a:off x="0" y="0"/>
+                      <a:ext cx="5486400" cy="3890632"/>
+                    </a:xfrm>
+                    <a:prstGeom prst="rect">
+                      <a:avLst/>
+                    </a:prstGeom>
+                  </pic:spPr>
+                </pic:pic>
+              </a:graphicData>
+            </a:graphic>
+          </wp:inline>
+        </w:drawing>
+      </w:r>
+    </w:p>
+    <w:p>
+      <w:pPr/>
+      <w:r>
+        <w:rPr>
+          <w:b/>
+        </w:rPr>
+        <w:t xml:space="preserve">La troisième figure du fichier est la preuve que l'appariement par type de jour fonctionne.</w:t>
+      </w:r>
+      <w:r>
+        <w:t xml:space="preserve"> Le 1er janvier 2027 tombe un vendredi. Apparié par date calendaire, il aurait hérité d'un vendredi ouvré de 2025 et PRO1 serait monté à 30-32 MW dans la journée, comme sur la semaine type plus haut. Ici PRO1 ne dépasse jamais </w:t>
+      </w:r>
+      <w:r>
+        <w:rPr>
+          <w:b/>
+        </w:rPr>
+        <w:t xml:space="preserve">16,4 MW</w:t>
+      </w:r>
+      <w:r>
+        <w:t xml:space="preserve"> : </w:t>
+      </w:r>
+      <w:r>
+        <w:rPr>
+          <w:rStyle w:val="CodeChar"/>
+        </w:rPr>
+        <w:t xml:space="preserve">_type_jour()</w:t>
+      </w:r>
+      <w:r>
+        <w:t xml:space="preserve"> lui a donné le code 7, </w:t>
+      </w:r>
+      <w:r>
+        <w:rPr>
+          <w:rStyle w:val="CodeChar"/>
+        </w:rPr>
+        <w:t xml:space="preserve">apparier_jours()</w:t>
+      </w:r>
+      <w:r>
+        <w:t xml:space="preserve"> est allé chercher un autre jour férié de 2025, et le profil obtenu est bien celui d'un jour chômé.</w:t>
+      </w:r>
+    </w:p>
+    <w:p>
+      <w:pPr/>
+      <w:r>
+        <w:t xml:space="preserve">RES1 raconte la même chose autrement : pas de creux marqué en milieu de journée, deux bosses larges (84 MW vers 12h, 90 MW vers 19h) au lieu du double pic serré d'un jour ouvré. Le portefeuille total culmine à </w:t>
+      </w:r>
+      <w:r>
+        <w:rPr>
+          <w:b/>
+        </w:rPr>
+        <w:t xml:space="preserve">106 MW à 19h</w:t>
+      </w:r>
+      <w:r>
+        <w:t xml:space="preserve"> et descend à 45 MW vers 5h.</w:t>
+      </w:r>
+    </w:p>
+    <w:p>
+      <w:pPr/>
+      <w:r>
+        <w:t xml:space="preserve">L'erreur évitée se chiffre : une quinzaine de MW sur les heures de bureau, soit de l'ordre de 150 MWh sur la seule journée. Et comme c'est précisément cette journée que l'étape 14 utilise pour construire la position ouverte, l'erreur se serait propagée jusqu'à l'ordre day-ahead.</w:t>
       </w:r>
     </w:p>
     <w:p>
@@ -9348,6 +9659,91 @@
       </w:r>
       <w:r>
         <w:t xml:space="preserve">. C'est le chiffre qui justifie à lui seul qu'on se couvre.</w:t>
+      </w:r>
+    </w:p>
+    <w:p>
+      <w:pPr/>
+      <w:r>
+        <w:drawing>
+          <wp:inline distT="0" distB="0" distL="0" distR="0">
+            <wp:extent cx="5486400" cy="3914078"/>
+            <wp:docPr id="5" name="image5"/>
+            <a:graphic xmlns:a="http://schemas.openxmlformats.org/drawingml/2006/main">
+              <a:graphicData uri="http://schemas.openxmlformats.org/drawingml/2006/picture">
+                <pic:pic xmlns:pic="http://schemas.openxmlformats.org/drawingml/2006/picture">
+                  <pic:nvPicPr>
+                    <pic:cNvPr id="5" name="image5"/>
+                    <pic:cNvPicPr/>
+                  </pic:nvPicPr>
+                  <pic:blipFill>
+                    <a:blip r:embed="rIdFig5"/>
+                    <a:stretch>
+                      <a:fillRect/>
+                    </a:stretch>
+                  </pic:blipFill>
+                  <pic:spPr>
+                    <a:xfrm>
+                      <a:off x="0" y="0"/>
+                      <a:ext cx="5486400" cy="3914078"/>
+                    </a:xfrm>
+                    <a:prstGeom prst="rect">
+                      <a:avLst/>
+                    </a:prstGeom>
+                  </pic:spPr>
+                </pic:pic>
+              </a:graphicData>
+            </a:graphic>
+          </wp:inline>
+        </w:drawing>
+      </w:r>
+    </w:p>
+    <w:p>
+      <w:pPr/>
+      <w:r>
+        <w:rPr>
+          <w:b/>
+        </w:rPr>
+        <w:t xml:space="preserve">C'est la figure que trace </w:t>
+      </w:r>
+      <w:r>
+        <w:rPr>
+          <w:rStyle w:val="CodeChar"/>
+          <w:b/>
+        </w:rPr>
+        <w:t xml:space="preserve">scenarios.py</w:t>
+      </w:r>
+      <w:r>
+        <w:t xml:space="preserve">, ici sur le scénario 2021 (</w:t>
+      </w:r>
+      <w:r>
+        <w:rPr>
+          <w:rStyle w:val="CodeChar"/>
+        </w:rPr>
+        <w:t xml:space="preserve">ANNEE_HISTORIQUE = 2021</w:t>
+      </w:r>
+      <w:r>
+        <w:t xml:space="preserve">). Les trois panneaux partagent le même axe de temps, et c'est tout l'intérêt : on lit la charge, le prix, puis le produit des deux, l'un sous l'autre.</w:t>
+      </w:r>
+    </w:p>
+    <w:p>
+      <w:pPr/>
+      <w:r>
+        <w:t xml:space="preserve">Le panneau du milieu, c'est la crise de 2021 telle qu'elle a eu lieu : un spot entre 20 et 100 €/MWh jusqu'en août, quelques heures négatives au printemps, puis une montée continue jusqu'à </w:t>
+      </w:r>
+      <w:r>
+        <w:rPr>
+          <w:b/>
+        </w:rPr>
+        <w:t xml:space="preserve">460 €/MWh fin décembre</w:t>
+      </w:r>
+      <w:r>
+        <w:t xml:space="preserve">. Le panneau du bas est le coût journalier au spot, et il ne ressemble ni à la charge ni au prix : il ressemble à leur produit. Les journées à 700 k€ de décembre ne sont pas les plus chargées de l'année, ce sont celles où un prix extrême tombe sur une charge d'hiver.</w:t>
+      </w:r>
+    </w:p>
+    <w:p>
+      <w:pPr/>
+      <w:r>
+        <w:t xml:space="preserve">C'est exactement l'écart entre prix moyen et prix pondéré décrit juste au-dessus, rendu visible : un coût total ne se déduit pas d'un prix moyen. C'est aussi pourquoi un seul scénario ne suffit pas — le même fichier lancé sur 2023 ou 2024 donne une figure très différente, d'où la comparaison de l'étape 12.</w:t>
       </w:r>
     </w:p>
     <w:p>
@@ -12649,17 +13045,17 @@
       <w:r>
         <w:drawing>
           <wp:inline distT="0" distB="0" distL="0" distR="0">
-            <wp:extent cx="5486400" cy="3086100"/>
-            <wp:docPr id="2" name="image2" descr="sortie de comparaison_scenarios.py · 6 stratégies, 4 scénarios"/>
+            <wp:extent cx="5486400" cy="4306398"/>
+            <wp:docPr id="6" name="image6"/>
             <a:graphic xmlns:a="http://schemas.openxmlformats.org/drawingml/2006/main">
               <a:graphicData uri="http://schemas.openxmlformats.org/drawingml/2006/picture">
                 <pic:pic xmlns:pic="http://schemas.openxmlformats.org/drawingml/2006/picture">
                   <pic:nvPicPr>
-                    <pic:cNvPr id="2" name="image2" descr="sortie de comparaison_scenarios.py · 6 stratégies, 4 scénarios"/>
+                    <pic:cNvPr id="6" name="image6"/>
                     <pic:cNvPicPr/>
                   </pic:nvPicPr>
                   <pic:blipFill>
-                    <a:blip r:embed="rId4"/>
+                    <a:blip r:embed="rIdFig6"/>
                     <a:stretch>
                       <a:fillRect/>
                     </a:stretch>
@@ -12667,7 +13063,7 @@
                   <pic:spPr>
                     <a:xfrm>
                       <a:off x="0" y="0"/>
-                      <a:ext cx="5486400" cy="3086100"/>
+                      <a:ext cx="5486400" cy="4306398"/>
                     </a:xfrm>
                     <a:prstGeom prst="rect">
                       <a:avLst/>
@@ -12683,31 +13079,68 @@
     <w:p>
       <w:pPr/>
       <w:r>
-        <w:t xml:space="preserve">sortie de comparaison_scenarios.py · 6 stratégies, 4 scénarios</w:t>
+        <w:rPr>
+          <w:b/>
+        </w:rPr>
+        <w:t xml:space="preserve">La figure de </w:t>
+      </w:r>
+      <w:r>
+        <w:rPr>
+          <w:rStyle w:val="CodeChar"/>
+          <w:b/>
+        </w:rPr>
+        <w:t xml:space="preserve">comparaison_scenarios.py</w:t>
+      </w:r>
+      <w:r>
+        <w:t xml:space="preserve"> : trois panneaux, quatre scénarios. Les prix spot journaliers, les charges journalières moyennes, et le coût total au spot de chacun.</w:t>
       </w:r>
     </w:p>
     <w:p>
       <w:pPr/>
       <w:r>
-        <w:t xml:space="preserve">Les six points se rangent sur une diagonale descendante : </w:t>
-      </w:r>
-      <w:r>
-        <w:rPr>
-          <w:b/>
-        </w:rPr>
-        <w:t xml:space="preserve">gagner en espérance se paie exactement en pire cas</w:t>
-      </w:r>
-      <w:r>
-        <w:t xml:space="preserve">. Notre 70/20/10 est le plus à gauche et le plus haut — la moins rentable en moyenne, la mieux protégée. Et l'écart entre le meilleur point et la ligne du plancher montre l'ampleur du problème : il ne manque pas quelques dixièmes, il manque </w:t>
-      </w:r>
-      <w:r>
-        <w:rPr>
-          <w:b/>
-        </w:rPr>
-        <w:t xml:space="preserve">plus de 5 €/MWh</w:t>
-      </w:r>
-      <w:r>
-        <w:t xml:space="preserve">.</w:t>
+        <w:t xml:space="preserve">Le panneau du bas donne la fourchette dans laquelle toute la décision se joue : de </w:t>
+      </w:r>
+      <w:r>
+        <w:rPr>
+          <w:b/>
+        </w:rPr>
+        <w:t xml:space="preserve">43,5 M€</w:t>
+      </w:r>
+      <w:r>
+        <w:t xml:space="preserve"> (scénario 2023) à </w:t>
+      </w:r>
+      <w:r>
+        <w:rPr>
+          <w:b/>
+        </w:rPr>
+        <w:t xml:space="preserve">56,2 M€</w:t>
+      </w:r>
+      <w:r>
+        <w:t xml:space="preserve"> (choc +20 %), soit près de 13 M€ d'écart sur un portefeuille de 537 GWh. Entre les trois années météo seules, l'écart n'est que de 3,4 M€. Autrement dit, c'est le scénario de choc — et lui seul — qui porte le risque auquel la couverture répond ; sans lui, les six stratégies du tableau ci-dessus se tiendraient dans un mouchoir de poche.</w:t>
+      </w:r>
+    </w:p>
+    <w:p>
+      <w:pPr/>
+      <w:r>
+        <w:t xml:space="preserve">Le panneau du milieu contient la démonstration la plus utile de tout le document : </w:t>
+      </w:r>
+      <w:r>
+        <w:rPr>
+          <w:b/>
+        </w:rPr>
+        <w:t xml:space="preserve">de mai à octobre, les quatre courbes de charge sont confondues</w:t>
+      </w:r>
+      <w:r>
+        <w:t xml:space="preserve">. C'est </w:t>
+      </w:r>
+      <w:r>
+        <w:rPr>
+          <w:rStyle w:val="CodeChar"/>
+        </w:rPr>
+        <w:t xml:space="preserve">g = 0</w:t>
+      </w:r>
+      <w:r>
+        <w:t xml:space="preserve"> hors période de chauffe — sans thermosensibilité, la météo ne change rien au volume, et les scénarios ne se séparent qu'entre novembre et avril. La courbe du scénario 2021 est d'ailleurs invisible : elle est recouverte par celle du choc, qui réutilise la météo de l'année la plus froide et ne modifie que le niveau de prix, jamais le volume.</w:t>
       </w:r>
     </w:p>
     <w:p>
@@ -16174,6 +16607,87 @@
       </w:r>
     </w:p>
     <w:p>
+      <w:pPr/>
+      <w:r>
+        <w:drawing>
+          <wp:inline distT="0" distB="0" distL="0" distR="0">
+            <wp:extent cx="5486400" cy="3792985"/>
+            <wp:docPr id="7" name="image7"/>
+            <a:graphic xmlns:a="http://schemas.openxmlformats.org/drawingml/2006/main">
+              <a:graphicData uri="http://schemas.openxmlformats.org/drawingml/2006/picture">
+                <pic:pic xmlns:pic="http://schemas.openxmlformats.org/drawingml/2006/picture">
+                  <pic:nvPicPr>
+                    <pic:cNvPr id="7" name="image7"/>
+                    <pic:cNvPicPr/>
+                  </pic:nvPicPr>
+                  <pic:blipFill>
+                    <a:blip r:embed="rIdFig7"/>
+                    <a:stretch>
+                      <a:fillRect/>
+                    </a:stretch>
+                  </pic:blipFill>
+                  <pic:spPr>
+                    <a:xfrm>
+                      <a:off x="0" y="0"/>
+                      <a:ext cx="5486400" cy="3792985"/>
+                    </a:xfrm>
+                    <a:prstGeom prst="rect">
+                      <a:avLst/>
+                    </a:prstGeom>
+                  </pic:spPr>
+                </pic:pic>
+              </a:graphicData>
+            </a:graphic>
+          </wp:inline>
+        </w:drawing>
+      </w:r>
+    </w:p>
+    <w:p>
+      <w:pPr/>
+      <w:r>
+        <w:t xml:space="preserve">La voilà. En haut : la charge à température normale (trait vert épais), les trois scénarios météo (pointillés), et la </w:t>
+      </w:r>
+      <w:r>
+        <w:rPr>
+          <w:b/>
+        </w:rPr>
+        <w:t xml:space="preserve">couverture livrée à 64 MW plats</w:t>
+      </w:r>
+      <w:r>
+        <w:t xml:space="preserve"> (trait rouge) — un ruban de forwards ne sait pas faire autre chose qu'une ligne droite. En bas : la différence des deux, heure par heure.</w:t>
+      </w:r>
+    </w:p>
+    <w:p>
+      <w:pPr/>
+      <w:r>
+        <w:t xml:space="preserve">Deux choses à lire. </w:t>
+      </w:r>
+      <w:r>
+        <w:rPr>
+          <w:b/>
+        </w:rPr>
+        <w:t xml:space="preserve">La position change de signe deux fois</w:t>
+      </w:r>
+      <w:r>
+        <w:t xml:space="preserve"> : longue (bleu) de minuit à 8h et de nouveau à 23h, courte (rouge) de 9h à 22h. Ce n'est pas un défaut de dimensionnement : un produit plat posé sur une courbe en cloche est forcément trop grand la nuit et trop petit le soir. </w:t>
+      </w:r>
+      <w:r>
+        <w:rPr>
+          <w:b/>
+        </w:rPr>
+        <w:t xml:space="preserve">L'amplitude est asymétrique</w:t>
+      </w:r>
+      <w:r>
+        <w:t xml:space="preserve"> : jusqu'à −22 MW à revendre vers 5h, mais +35 MW à acheter vers 19h. On revend au creux, donc au prix bas, et on achète à la pointe, donc au prix haut. C'est tout le coût résiduel que la marge de l'étape 12 encaisse.</w:t>
+      </w:r>
+    </w:p>
+    <w:p>
+      <w:pPr/>
+      <w:r>
+        <w:t xml:space="preserve">Les pointillés donnent la mesure de ce qui reste incertain : à 19h, selon l'année météo retenue, la charge va de 79 MW (scénario 2023) à 104 MW (scénario 2021). Vingt-cinq MW d'écart sur une seule heure, qu'aucun forward ne couvre — c'est ce résidu-là qui passera par le spot.</w:t>
+      </w:r>
+    </w:p>
+    <w:p>
       <w:pPr>
         <w:pStyle w:val="Heading3"/>
       </w:pPr>
@@ -16521,49 +17035,7 @@
     <w:p>
       <w:pPr/>
       <w:r>
-        <w:drawing>
-          <wp:inline distT="0" distB="0" distL="0" distR="0">
-            <wp:extent cx="5486400" cy="2939142"/>
-            <wp:docPr id="3" name="image3" descr="fichiers EEX du prof · prix de règlement Base aux trois jalons"/>
-            <a:graphic xmlns:a="http://schemas.openxmlformats.org/drawingml/2006/main">
-              <a:graphicData uri="http://schemas.openxmlformats.org/drawingml/2006/picture">
-                <pic:pic xmlns:pic="http://schemas.openxmlformats.org/drawingml/2006/picture">
-                  <pic:nvPicPr>
-                    <pic:cNvPr id="3" name="image3" descr="fichiers EEX du prof · prix de règlement Base aux trois jalons"/>
-                    <pic:cNvPicPr/>
-                  </pic:nvPicPr>
-                  <pic:blipFill>
-                    <a:blip r:embed="rId5"/>
-                    <a:stretch>
-                      <a:fillRect/>
-                    </a:stretch>
-                  </pic:blipFill>
-                  <pic:spPr>
-                    <a:xfrm>
-                      <a:off x="0" y="0"/>
-                      <a:ext cx="5486400" cy="2939142"/>
-                    </a:xfrm>
-                    <a:prstGeom prst="rect">
-                      <a:avLst/>
-                    </a:prstGeom>
-                  </pic:spPr>
-                </pic:pic>
-              </a:graphicData>
-            </a:graphic>
-          </wp:inline>
-        </w:drawing>
-      </w:r>
-    </w:p>
-    <w:p>
-      <w:pPr/>
-      <w:r>
-        <w:t xml:space="preserve">fichiers EEX du prof · prix de règlement Base aux trois jalons</w:t>
-      </w:r>
-    </w:p>
-    <w:p>
-      <w:pPr/>
-      <w:r>
-        <w:t xml:space="preserve">Toutes les courbes font le même V : baisse jusqu'au 1er décembre, remontée en fin de mois. Mais </w:t>
+        <w:t xml:space="preserve">Tous les produits font le même V entre les trois jalons : baisse jusqu'au 1er décembre, remontée au 31. Mais </w:t>
       </w:r>
       <w:r>
         <w:rPr>
@@ -18068,17 +18540,17 @@
       <w:r>
         <w:drawing>
           <wp:inline distT="0" distB="0" distL="0" distR="0">
-            <wp:extent cx="5486400" cy="2792185"/>
-            <wp:docPr id="4" name="image4" descr="sortie de spot_t3.py · 24 heures du 01/01/2027, température prévue et solaire déduit"/>
+            <wp:extent cx="5486400" cy="3786434"/>
+            <wp:docPr id="8" name="image8"/>
             <a:graphic xmlns:a="http://schemas.openxmlformats.org/drawingml/2006/main">
               <a:graphicData uri="http://schemas.openxmlformats.org/drawingml/2006/picture">
                 <pic:pic xmlns:pic="http://schemas.openxmlformats.org/drawingml/2006/picture">
                   <pic:nvPicPr>
-                    <pic:cNvPr id="4" name="image4" descr="sortie de spot_t3.py · 24 heures du 01/01/2027, température prévue et solaire déduit"/>
+                    <pic:cNvPr id="8" name="image8"/>
                     <pic:cNvPicPr/>
                   </pic:nvPicPr>
                   <pic:blipFill>
-                    <a:blip r:embed="rId6"/>
+                    <a:blip r:embed="rIdFig8"/>
                     <a:stretch>
                       <a:fillRect/>
                     </a:stretch>
@@ -18086,7 +18558,7 @@
                   <pic:spPr>
                     <a:xfrm>
                       <a:off x="0" y="0"/>
-                      <a:ext cx="5486400" cy="2792185"/>
+                      <a:ext cx="5486400" cy="3786434"/>
                     </a:xfrm>
                     <a:prstGeom prst="rect">
                       <a:avLst/>
@@ -18102,40 +18574,79 @@
     <w:p>
       <w:pPr/>
       <w:r>
-        <w:t xml:space="preserve">sortie de spot_t3.py · 24 heures du 01/01/2027, température prévue et solaire déduit</w:t>
+        <w:rPr>
+          <w:b/>
+        </w:rPr>
+        <w:t xml:space="preserve">La même journée que l'étape 14, trois mois plus tard, avec deux informations de plus.</w:t>
+      </w:r>
+      <w:r>
+        <w:t xml:space="preserve"> C'est la figure de </w:t>
+      </w:r>
+      <w:r>
+        <w:rPr>
+          <w:rStyle w:val="CodeChar"/>
+        </w:rPr>
+        <w:t xml:space="preserve">spot_t3.py</w:t>
+      </w:r>
+      <w:r>
+        <w:t xml:space="preserve">. En haut : la charge à température prévue (vert), la charge à température normale (pointillé gris), la couverture à 64 MW (rouge) et la production solaire (barres orange). En bas : la position ouverte heure par heure, l'heure 14h-15h de l'objectif 2 surlignée en jaune.</w:t>
       </w:r>
     </w:p>
     <w:p>
       <w:pPr/>
       <w:r>
-        <w:t xml:space="preserve">C'est le graphique que le §5.2 réclame : </w:t>
-      </w:r>
-      <w:r>
-        <w:rPr>
-          <w:i/>
-        </w:rPr>
-        <w:t xml:space="preserve">bars above zero for the hours to buy, below zero for the hours to sell</w:t>
-      </w:r>
-      <w:r>
-        <w:t xml:space="preserve">. La forme raconte tout le problème du ruban plat — </w:t>
-      </w:r>
-      <w:r>
-        <w:rPr>
-          <w:b/>
-        </w:rPr>
-        <w:t xml:space="preserve">long de minuit à 8 h</w:t>
-      </w:r>
-      <w:r>
-        <w:t xml:space="preserve">, quand la couverture de 64 MW dépasse une charge creuse, puis </w:t>
-      </w:r>
-      <w:r>
-        <w:rPr>
-          <w:b/>
-        </w:rPr>
-        <w:t xml:space="preserve">de plus en plus court à mesure que la soirée monte</w:t>
-      </w:r>
-      <w:r>
-        <w:t xml:space="preserve">, jusqu'à 50 MW à 19 h. Le léger repli de 12 h à 14 h est le solaire : 24 MWh à midi effacent une partie du besoin, et le trou se referme dès que le soleil baisse.</w:t>
+        <w:t xml:space="preserve">L'écart entre le trait vert et le pointillé gris, c'est la prévision météo — </w:t>
+      </w:r>
+      <w:r>
+        <w:rPr>
+          <w:b/>
+        </w:rPr>
+        <w:t xml:space="preserve">+0,44 °C annoncés contre 4,79 °C de normale</w:t>
+      </w:r>
+      <w:r>
+        <w:t xml:space="preserve">, donc un CM autour de 1,09, donc 4 à 14 MW de charge en plus selon l'heure. Les barres orange, c'est la centrale de 80 MWc : elle ne produit qu'entre 8h et 16h, culmine à 24 MW vers midi, et </w:t>
+      </w:r>
+      <w:r>
+        <w:rPr>
+          <w:b/>
+        </w:rPr>
+        <w:t xml:space="preserve">ne touche jamais la pointe du soir</w:t>
+      </w:r>
+      <w:r>
+        <w:t xml:space="preserve">. Une centrale solaire ne couvre pas un portefeuille résidentiel d'hiver, elle déplace seulement le problème de midi vers 19h.</w:t>
+      </w:r>
+    </w:p>
+    <w:p>
+      <w:pPr/>
+      <w:r>
+        <w:t xml:space="preserve">Le panneau du bas le montre directement : la journée reste </w:t>
+      </w:r>
+      <w:r>
+        <w:rPr>
+          <w:b/>
+        </w:rPr>
+        <w:t xml:space="preserve">longue de minuit à 7h</w:t>
+      </w:r>
+      <w:r>
+        <w:t xml:space="preserve"> (jusqu'à 15 MW à revendre), passe short à partir de 8h, puis se creuse à 13h-14h — c'est le solaire qui comble presque tout le besoin de milieu de journée — avant le mur du soir à </w:t>
+      </w:r>
+      <w:r>
+        <w:rPr>
+          <w:b/>
+        </w:rPr>
+        <w:t xml:space="preserve">+50 MW à 19h</w:t>
+      </w:r>
+      <w:r>
+        <w:t xml:space="preserve">. À 14h, la barre surlignée vaut </w:t>
+      </w:r>
+      <w:r>
+        <w:rPr>
+          <w:b/>
+        </w:rPr>
+        <w:t xml:space="preserve">+3,89 MW</w:t>
+      </w:r>
+      <w:r>
+        <w:t xml:space="preserve"> : c'est le chiffre de l'objectif 2.</w:t>
       </w:r>
     </w:p>
     <w:p>

</xml_diff>